<commit_message>
Mengumpulkan tugas pekan 12
</commit_message>
<xml_diff>
--- a/Pekan-11/Laporan_PraktikumPekan11_RyandiAgungMazhendra_707012500024.docx
+++ b/Pekan-11/Laporan_PraktikumPekan11_RyandiAgungMazhendra_707012500024.docx
@@ -98,7 +98,29 @@
           <w:sz w:val="40"/>
           <w:szCs w:val="40"/>
         </w:rPr>
-        <w:t>1: Pengenalan React</w:t>
+        <w:t xml:space="preserve">1: </w:t>
+      </w:r>
+      <w:proofErr w:type="spellStart"/>
+      <w:r>
+        <w:rPr>
+          <w:rFonts w:ascii="Aptos Display" w:hAnsi="Aptos Display"/>
+          <w:b/>
+          <w:bCs/>
+          <w:sz w:val="40"/>
+          <w:szCs w:val="40"/>
+        </w:rPr>
+        <w:t>Pengenalan</w:t>
+      </w:r>
+      <w:proofErr w:type="spellEnd"/>
+      <w:r>
+        <w:rPr>
+          <w:rFonts w:ascii="Aptos Display" w:hAnsi="Aptos Display"/>
+          <w:b/>
+          <w:bCs/>
+          <w:sz w:val="40"/>
+          <w:szCs w:val="40"/>
+        </w:rPr>
+        <w:t xml:space="preserve"> React</w:t>
       </w:r>
     </w:p>
     <w:p>
@@ -111,13 +133,23 @@
           <w:lang w:val="id-ID"/>
         </w:rPr>
       </w:pPr>
+      <w:proofErr w:type="spellStart"/>
       <w:r>
         <w:rPr>
           <w:rFonts w:ascii="Aptos" w:hAnsi="Aptos"/>
           <w:sz w:val="32"/>
           <w:szCs w:val="32"/>
         </w:rPr>
-        <w:t>Pemrograman Web</w:t>
+        <w:t>Pemrograman</w:t>
+      </w:r>
+      <w:proofErr w:type="spellEnd"/>
+      <w:r>
+        <w:rPr>
+          <w:rFonts w:ascii="Aptos" w:hAnsi="Aptos"/>
+          <w:sz w:val="32"/>
+          <w:szCs w:val="32"/>
+        </w:rPr>
+        <w:t xml:space="preserve"> Web</w:t>
       </w:r>
     </w:p>
     <w:p>
@@ -482,29 +514,167 @@
           <w:szCs w:val="28"/>
         </w:rPr>
       </w:pPr>
-      <w:r>
-        <w:rPr>
-          <w:rFonts w:ascii="Aptos" w:hAnsi="Aptos" w:cs="Arial"/>
-          <w:sz w:val="28"/>
-          <w:szCs w:val="28"/>
-        </w:rPr>
-        <w:t>Memahami konsep dasar React sebagai library JavaScript untuk membangun</w:t>
-      </w:r>
-      <w:r>
-        <w:rPr>
-          <w:rFonts w:ascii="Aptos" w:hAnsi="Aptos" w:cs="Arial"/>
-          <w:sz w:val="28"/>
-          <w:szCs w:val="28"/>
-        </w:rPr>
-        <w:t xml:space="preserve"> </w:t>
-      </w:r>
-      <w:r>
-        <w:rPr>
-          <w:rFonts w:ascii="Aptos" w:hAnsi="Aptos" w:cs="Arial"/>
-          <w:sz w:val="28"/>
-          <w:szCs w:val="28"/>
-        </w:rPr>
-        <w:t>antarmuka pengguna (UI) berbasis component dan declarative programming.</w:t>
+      <w:proofErr w:type="spellStart"/>
+      <w:r>
+        <w:rPr>
+          <w:rFonts w:ascii="Aptos" w:hAnsi="Aptos" w:cs="Arial"/>
+          <w:sz w:val="28"/>
+          <w:szCs w:val="28"/>
+        </w:rPr>
+        <w:t>Memahami</w:t>
+      </w:r>
+      <w:proofErr w:type="spellEnd"/>
+      <w:r>
+        <w:rPr>
+          <w:rFonts w:ascii="Aptos" w:hAnsi="Aptos" w:cs="Arial"/>
+          <w:sz w:val="28"/>
+          <w:szCs w:val="28"/>
+        </w:rPr>
+        <w:t xml:space="preserve"> </w:t>
+      </w:r>
+      <w:proofErr w:type="spellStart"/>
+      <w:r>
+        <w:rPr>
+          <w:rFonts w:ascii="Aptos" w:hAnsi="Aptos" w:cs="Arial"/>
+          <w:sz w:val="28"/>
+          <w:szCs w:val="28"/>
+        </w:rPr>
+        <w:t>konsep</w:t>
+      </w:r>
+      <w:proofErr w:type="spellEnd"/>
+      <w:r>
+        <w:rPr>
+          <w:rFonts w:ascii="Aptos" w:hAnsi="Aptos" w:cs="Arial"/>
+          <w:sz w:val="28"/>
+          <w:szCs w:val="28"/>
+        </w:rPr>
+        <w:t xml:space="preserve"> </w:t>
+      </w:r>
+      <w:proofErr w:type="spellStart"/>
+      <w:r>
+        <w:rPr>
+          <w:rFonts w:ascii="Aptos" w:hAnsi="Aptos" w:cs="Arial"/>
+          <w:sz w:val="28"/>
+          <w:szCs w:val="28"/>
+        </w:rPr>
+        <w:t>dasar</w:t>
+      </w:r>
+      <w:proofErr w:type="spellEnd"/>
+      <w:r>
+        <w:rPr>
+          <w:rFonts w:ascii="Aptos" w:hAnsi="Aptos" w:cs="Arial"/>
+          <w:sz w:val="28"/>
+          <w:szCs w:val="28"/>
+        </w:rPr>
+        <w:t xml:space="preserve"> React </w:t>
+      </w:r>
+      <w:proofErr w:type="spellStart"/>
+      <w:r>
+        <w:rPr>
+          <w:rFonts w:ascii="Aptos" w:hAnsi="Aptos" w:cs="Arial"/>
+          <w:sz w:val="28"/>
+          <w:szCs w:val="28"/>
+        </w:rPr>
+        <w:t>sebagai</w:t>
+      </w:r>
+      <w:proofErr w:type="spellEnd"/>
+      <w:r>
+        <w:rPr>
+          <w:rFonts w:ascii="Aptos" w:hAnsi="Aptos" w:cs="Arial"/>
+          <w:sz w:val="28"/>
+          <w:szCs w:val="28"/>
+        </w:rPr>
+        <w:t xml:space="preserve"> library JavaScript </w:t>
+      </w:r>
+      <w:proofErr w:type="spellStart"/>
+      <w:r>
+        <w:rPr>
+          <w:rFonts w:ascii="Aptos" w:hAnsi="Aptos" w:cs="Arial"/>
+          <w:sz w:val="28"/>
+          <w:szCs w:val="28"/>
+        </w:rPr>
+        <w:t>untuk</w:t>
+      </w:r>
+      <w:proofErr w:type="spellEnd"/>
+      <w:r>
+        <w:rPr>
+          <w:rFonts w:ascii="Aptos" w:hAnsi="Aptos" w:cs="Arial"/>
+          <w:sz w:val="28"/>
+          <w:szCs w:val="28"/>
+        </w:rPr>
+        <w:t xml:space="preserve"> </w:t>
+      </w:r>
+      <w:proofErr w:type="spellStart"/>
+      <w:r>
+        <w:rPr>
+          <w:rFonts w:ascii="Aptos" w:hAnsi="Aptos" w:cs="Arial"/>
+          <w:sz w:val="28"/>
+          <w:szCs w:val="28"/>
+        </w:rPr>
+        <w:t>membangun</w:t>
+      </w:r>
+      <w:proofErr w:type="spellEnd"/>
+      <w:r>
+        <w:rPr>
+          <w:rFonts w:ascii="Aptos" w:hAnsi="Aptos" w:cs="Arial"/>
+          <w:sz w:val="28"/>
+          <w:szCs w:val="28"/>
+        </w:rPr>
+        <w:t xml:space="preserve"> </w:t>
+      </w:r>
+      <w:proofErr w:type="spellStart"/>
+      <w:r>
+        <w:rPr>
+          <w:rFonts w:ascii="Aptos" w:hAnsi="Aptos" w:cs="Arial"/>
+          <w:sz w:val="28"/>
+          <w:szCs w:val="28"/>
+        </w:rPr>
+        <w:t>antarmuka</w:t>
+      </w:r>
+      <w:proofErr w:type="spellEnd"/>
+      <w:r>
+        <w:rPr>
+          <w:rFonts w:ascii="Aptos" w:hAnsi="Aptos" w:cs="Arial"/>
+          <w:sz w:val="28"/>
+          <w:szCs w:val="28"/>
+        </w:rPr>
+        <w:t xml:space="preserve"> </w:t>
+      </w:r>
+      <w:proofErr w:type="spellStart"/>
+      <w:r>
+        <w:rPr>
+          <w:rFonts w:ascii="Aptos" w:hAnsi="Aptos" w:cs="Arial"/>
+          <w:sz w:val="28"/>
+          <w:szCs w:val="28"/>
+        </w:rPr>
+        <w:t>pengguna</w:t>
+      </w:r>
+      <w:proofErr w:type="spellEnd"/>
+      <w:r>
+        <w:rPr>
+          <w:rFonts w:ascii="Aptos" w:hAnsi="Aptos" w:cs="Arial"/>
+          <w:sz w:val="28"/>
+          <w:szCs w:val="28"/>
+        </w:rPr>
+        <w:t xml:space="preserve"> (UI) </w:t>
+      </w:r>
+      <w:proofErr w:type="spellStart"/>
+      <w:r>
+        <w:rPr>
+          <w:rFonts w:ascii="Aptos" w:hAnsi="Aptos" w:cs="Arial"/>
+          <w:sz w:val="28"/>
+          <w:szCs w:val="28"/>
+        </w:rPr>
+        <w:t>berbasis</w:t>
+      </w:r>
+      <w:proofErr w:type="spellEnd"/>
+      <w:r>
+        <w:rPr>
+          <w:rFonts w:ascii="Aptos" w:hAnsi="Aptos" w:cs="Arial"/>
+          <w:sz w:val="28"/>
+          <w:szCs w:val="28"/>
+        </w:rPr>
+        <w:t xml:space="preserve"> component dan declarative programming.</w:t>
       </w:r>
     </w:p>
     <w:p>
@@ -520,29 +690,167 @@
           <w:szCs w:val="28"/>
         </w:rPr>
       </w:pPr>
-      <w:r>
-        <w:rPr>
-          <w:rFonts w:ascii="Aptos" w:hAnsi="Aptos" w:cs="Arial"/>
-          <w:sz w:val="28"/>
-          <w:szCs w:val="28"/>
-        </w:rPr>
-        <w:t>Memahami arsitektur UI berbasis component serta perbedaan pendekatan React</w:t>
-      </w:r>
-      <w:r>
-        <w:rPr>
-          <w:rFonts w:ascii="Aptos" w:hAnsi="Aptos" w:cs="Arial"/>
-          <w:sz w:val="28"/>
-          <w:szCs w:val="28"/>
-        </w:rPr>
-        <w:t xml:space="preserve"> </w:t>
-      </w:r>
-      <w:r>
-        <w:rPr>
-          <w:rFonts w:ascii="Aptos" w:hAnsi="Aptos" w:cs="Arial"/>
-          <w:sz w:val="28"/>
-          <w:szCs w:val="28"/>
-        </w:rPr>
-        <w:t>dibandingkan manipulasi DOM tradisional (Vanilla JS).</w:t>
+      <w:proofErr w:type="spellStart"/>
+      <w:r>
+        <w:rPr>
+          <w:rFonts w:ascii="Aptos" w:hAnsi="Aptos" w:cs="Arial"/>
+          <w:sz w:val="28"/>
+          <w:szCs w:val="28"/>
+        </w:rPr>
+        <w:t>Memahami</w:t>
+      </w:r>
+      <w:proofErr w:type="spellEnd"/>
+      <w:r>
+        <w:rPr>
+          <w:rFonts w:ascii="Aptos" w:hAnsi="Aptos" w:cs="Arial"/>
+          <w:sz w:val="28"/>
+          <w:szCs w:val="28"/>
+        </w:rPr>
+        <w:t xml:space="preserve"> </w:t>
+      </w:r>
+      <w:proofErr w:type="spellStart"/>
+      <w:r>
+        <w:rPr>
+          <w:rFonts w:ascii="Aptos" w:hAnsi="Aptos" w:cs="Arial"/>
+          <w:sz w:val="28"/>
+          <w:szCs w:val="28"/>
+        </w:rPr>
+        <w:t>arsitektur</w:t>
+      </w:r>
+      <w:proofErr w:type="spellEnd"/>
+      <w:r>
+        <w:rPr>
+          <w:rFonts w:ascii="Aptos" w:hAnsi="Aptos" w:cs="Arial"/>
+          <w:sz w:val="28"/>
+          <w:szCs w:val="28"/>
+        </w:rPr>
+        <w:t xml:space="preserve"> UI </w:t>
+      </w:r>
+      <w:proofErr w:type="spellStart"/>
+      <w:r>
+        <w:rPr>
+          <w:rFonts w:ascii="Aptos" w:hAnsi="Aptos" w:cs="Arial"/>
+          <w:sz w:val="28"/>
+          <w:szCs w:val="28"/>
+        </w:rPr>
+        <w:t>berbasis</w:t>
+      </w:r>
+      <w:proofErr w:type="spellEnd"/>
+      <w:r>
+        <w:rPr>
+          <w:rFonts w:ascii="Aptos" w:hAnsi="Aptos" w:cs="Arial"/>
+          <w:sz w:val="28"/>
+          <w:szCs w:val="28"/>
+        </w:rPr>
+        <w:t xml:space="preserve"> component </w:t>
+      </w:r>
+      <w:proofErr w:type="spellStart"/>
+      <w:r>
+        <w:rPr>
+          <w:rFonts w:ascii="Aptos" w:hAnsi="Aptos" w:cs="Arial"/>
+          <w:sz w:val="28"/>
+          <w:szCs w:val="28"/>
+        </w:rPr>
+        <w:t>serta</w:t>
+      </w:r>
+      <w:proofErr w:type="spellEnd"/>
+      <w:r>
+        <w:rPr>
+          <w:rFonts w:ascii="Aptos" w:hAnsi="Aptos" w:cs="Arial"/>
+          <w:sz w:val="28"/>
+          <w:szCs w:val="28"/>
+        </w:rPr>
+        <w:t xml:space="preserve"> </w:t>
+      </w:r>
+      <w:proofErr w:type="spellStart"/>
+      <w:r>
+        <w:rPr>
+          <w:rFonts w:ascii="Aptos" w:hAnsi="Aptos" w:cs="Arial"/>
+          <w:sz w:val="28"/>
+          <w:szCs w:val="28"/>
+        </w:rPr>
+        <w:t>perbedaan</w:t>
+      </w:r>
+      <w:proofErr w:type="spellEnd"/>
+      <w:r>
+        <w:rPr>
+          <w:rFonts w:ascii="Aptos" w:hAnsi="Aptos" w:cs="Arial"/>
+          <w:sz w:val="28"/>
+          <w:szCs w:val="28"/>
+        </w:rPr>
+        <w:t xml:space="preserve"> </w:t>
+      </w:r>
+      <w:proofErr w:type="spellStart"/>
+      <w:r>
+        <w:rPr>
+          <w:rFonts w:ascii="Aptos" w:hAnsi="Aptos" w:cs="Arial"/>
+          <w:sz w:val="28"/>
+          <w:szCs w:val="28"/>
+        </w:rPr>
+        <w:t>pendekatan</w:t>
+      </w:r>
+      <w:proofErr w:type="spellEnd"/>
+      <w:r>
+        <w:rPr>
+          <w:rFonts w:ascii="Aptos" w:hAnsi="Aptos" w:cs="Arial"/>
+          <w:sz w:val="28"/>
+          <w:szCs w:val="28"/>
+        </w:rPr>
+        <w:t xml:space="preserve"> React </w:t>
+      </w:r>
+      <w:proofErr w:type="spellStart"/>
+      <w:r>
+        <w:rPr>
+          <w:rFonts w:ascii="Aptos" w:hAnsi="Aptos" w:cs="Arial"/>
+          <w:sz w:val="28"/>
+          <w:szCs w:val="28"/>
+        </w:rPr>
+        <w:t>dibandingkan</w:t>
+      </w:r>
+      <w:proofErr w:type="spellEnd"/>
+      <w:r>
+        <w:rPr>
+          <w:rFonts w:ascii="Aptos" w:hAnsi="Aptos" w:cs="Arial"/>
+          <w:sz w:val="28"/>
+          <w:szCs w:val="28"/>
+        </w:rPr>
+        <w:t xml:space="preserve"> </w:t>
+      </w:r>
+      <w:proofErr w:type="spellStart"/>
+      <w:r>
+        <w:rPr>
+          <w:rFonts w:ascii="Aptos" w:hAnsi="Aptos" w:cs="Arial"/>
+          <w:sz w:val="28"/>
+          <w:szCs w:val="28"/>
+        </w:rPr>
+        <w:t>manipulasi</w:t>
+      </w:r>
+      <w:proofErr w:type="spellEnd"/>
+      <w:r>
+        <w:rPr>
+          <w:rFonts w:ascii="Aptos" w:hAnsi="Aptos" w:cs="Arial"/>
+          <w:sz w:val="28"/>
+          <w:szCs w:val="28"/>
+        </w:rPr>
+        <w:t xml:space="preserve"> DOM </w:t>
+      </w:r>
+      <w:proofErr w:type="spellStart"/>
+      <w:r>
+        <w:rPr>
+          <w:rFonts w:ascii="Aptos" w:hAnsi="Aptos" w:cs="Arial"/>
+          <w:sz w:val="28"/>
+          <w:szCs w:val="28"/>
+        </w:rPr>
+        <w:t>tradisional</w:t>
+      </w:r>
+      <w:proofErr w:type="spellEnd"/>
+      <w:r>
+        <w:rPr>
+          <w:rFonts w:ascii="Aptos" w:hAnsi="Aptos" w:cs="Arial"/>
+          <w:sz w:val="28"/>
+          <w:szCs w:val="28"/>
+        </w:rPr>
+        <w:t xml:space="preserve"> (Vanilla JS).</w:t>
       </w:r>
     </w:p>
     <w:p>
@@ -558,29 +866,77 @@
           <w:szCs w:val="28"/>
         </w:rPr>
       </w:pPr>
-      <w:r>
-        <w:rPr>
-          <w:rFonts w:ascii="Aptos" w:hAnsi="Aptos" w:cs="Arial"/>
-          <w:sz w:val="28"/>
-          <w:szCs w:val="28"/>
-        </w:rPr>
-        <w:t>Melakukan setup environment React dan membuat aplikasi React menggunakan tool</w:t>
-      </w:r>
-      <w:r>
-        <w:rPr>
-          <w:rFonts w:ascii="Aptos" w:hAnsi="Aptos" w:cs="Arial"/>
-          <w:sz w:val="28"/>
-          <w:szCs w:val="28"/>
-        </w:rPr>
-        <w:t xml:space="preserve"> </w:t>
-      </w:r>
-      <w:r>
-        <w:rPr>
-          <w:rFonts w:ascii="Aptos" w:hAnsi="Aptos" w:cs="Arial"/>
-          <w:sz w:val="28"/>
-          <w:szCs w:val="28"/>
-        </w:rPr>
-        <w:t>modern (Vite / Create React App).</w:t>
+      <w:proofErr w:type="spellStart"/>
+      <w:r>
+        <w:rPr>
+          <w:rFonts w:ascii="Aptos" w:hAnsi="Aptos" w:cs="Arial"/>
+          <w:sz w:val="28"/>
+          <w:szCs w:val="28"/>
+        </w:rPr>
+        <w:t>Melakukan</w:t>
+      </w:r>
+      <w:proofErr w:type="spellEnd"/>
+      <w:r>
+        <w:rPr>
+          <w:rFonts w:ascii="Aptos" w:hAnsi="Aptos" w:cs="Arial"/>
+          <w:sz w:val="28"/>
+          <w:szCs w:val="28"/>
+        </w:rPr>
+        <w:t xml:space="preserve"> setup environment React dan </w:t>
+      </w:r>
+      <w:proofErr w:type="spellStart"/>
+      <w:r>
+        <w:rPr>
+          <w:rFonts w:ascii="Aptos" w:hAnsi="Aptos" w:cs="Arial"/>
+          <w:sz w:val="28"/>
+          <w:szCs w:val="28"/>
+        </w:rPr>
+        <w:t>membuat</w:t>
+      </w:r>
+      <w:proofErr w:type="spellEnd"/>
+      <w:r>
+        <w:rPr>
+          <w:rFonts w:ascii="Aptos" w:hAnsi="Aptos" w:cs="Arial"/>
+          <w:sz w:val="28"/>
+          <w:szCs w:val="28"/>
+        </w:rPr>
+        <w:t xml:space="preserve"> </w:t>
+      </w:r>
+      <w:proofErr w:type="spellStart"/>
+      <w:r>
+        <w:rPr>
+          <w:rFonts w:ascii="Aptos" w:hAnsi="Aptos" w:cs="Arial"/>
+          <w:sz w:val="28"/>
+          <w:szCs w:val="28"/>
+        </w:rPr>
+        <w:t>aplikasi</w:t>
+      </w:r>
+      <w:proofErr w:type="spellEnd"/>
+      <w:r>
+        <w:rPr>
+          <w:rFonts w:ascii="Aptos" w:hAnsi="Aptos" w:cs="Arial"/>
+          <w:sz w:val="28"/>
+          <w:szCs w:val="28"/>
+        </w:rPr>
+        <w:t xml:space="preserve"> React </w:t>
+      </w:r>
+      <w:proofErr w:type="spellStart"/>
+      <w:r>
+        <w:rPr>
+          <w:rFonts w:ascii="Aptos" w:hAnsi="Aptos" w:cs="Arial"/>
+          <w:sz w:val="28"/>
+          <w:szCs w:val="28"/>
+        </w:rPr>
+        <w:t>menggunakan</w:t>
+      </w:r>
+      <w:proofErr w:type="spellEnd"/>
+      <w:r>
+        <w:rPr>
+          <w:rFonts w:ascii="Aptos" w:hAnsi="Aptos" w:cs="Arial"/>
+          <w:sz w:val="28"/>
+          <w:szCs w:val="28"/>
+        </w:rPr>
+        <w:t xml:space="preserve"> tool modern (Vite / Create React App).</w:t>
       </w:r>
     </w:p>
     <w:p>
@@ -602,15 +958,115 @@
           <w:sz w:val="28"/>
           <w:szCs w:val="28"/>
         </w:rPr>
-        <w:t>Membuat dan mengelola component menggunakan JSX serta memahami struktur file</w:t>
-      </w:r>
-      <w:r>
-        <w:rPr>
-          <w:rFonts w:ascii="Aptos" w:hAnsi="Aptos" w:cs="Arial"/>
-          <w:sz w:val="28"/>
-          <w:szCs w:val="28"/>
-        </w:rPr>
-        <w:t xml:space="preserve"> aplikasi React.</w:t>
+        <w:t xml:space="preserve">Membuat dan </w:t>
+      </w:r>
+      <w:proofErr w:type="spellStart"/>
+      <w:r>
+        <w:rPr>
+          <w:rFonts w:ascii="Aptos" w:hAnsi="Aptos" w:cs="Arial"/>
+          <w:sz w:val="28"/>
+          <w:szCs w:val="28"/>
+        </w:rPr>
+        <w:t>mengelola</w:t>
+      </w:r>
+      <w:proofErr w:type="spellEnd"/>
+      <w:r>
+        <w:rPr>
+          <w:rFonts w:ascii="Aptos" w:hAnsi="Aptos" w:cs="Arial"/>
+          <w:sz w:val="28"/>
+          <w:szCs w:val="28"/>
+        </w:rPr>
+        <w:t xml:space="preserve"> component </w:t>
+      </w:r>
+      <w:proofErr w:type="spellStart"/>
+      <w:r>
+        <w:rPr>
+          <w:rFonts w:ascii="Aptos" w:hAnsi="Aptos" w:cs="Arial"/>
+          <w:sz w:val="28"/>
+          <w:szCs w:val="28"/>
+        </w:rPr>
+        <w:t>menggunakan</w:t>
+      </w:r>
+      <w:proofErr w:type="spellEnd"/>
+      <w:r>
+        <w:rPr>
+          <w:rFonts w:ascii="Aptos" w:hAnsi="Aptos" w:cs="Arial"/>
+          <w:sz w:val="28"/>
+          <w:szCs w:val="28"/>
+        </w:rPr>
+        <w:t xml:space="preserve"> JSX </w:t>
+      </w:r>
+      <w:proofErr w:type="spellStart"/>
+      <w:r>
+        <w:rPr>
+          <w:rFonts w:ascii="Aptos" w:hAnsi="Aptos" w:cs="Arial"/>
+          <w:sz w:val="28"/>
+          <w:szCs w:val="28"/>
+        </w:rPr>
+        <w:t>serta</w:t>
+      </w:r>
+      <w:proofErr w:type="spellEnd"/>
+      <w:r>
+        <w:rPr>
+          <w:rFonts w:ascii="Aptos" w:hAnsi="Aptos" w:cs="Arial"/>
+          <w:sz w:val="28"/>
+          <w:szCs w:val="28"/>
+        </w:rPr>
+        <w:t xml:space="preserve"> </w:t>
+      </w:r>
+      <w:proofErr w:type="spellStart"/>
+      <w:r>
+        <w:rPr>
+          <w:rFonts w:ascii="Aptos" w:hAnsi="Aptos" w:cs="Arial"/>
+          <w:sz w:val="28"/>
+          <w:szCs w:val="28"/>
+        </w:rPr>
+        <w:t>memahami</w:t>
+      </w:r>
+      <w:proofErr w:type="spellEnd"/>
+      <w:r>
+        <w:rPr>
+          <w:rFonts w:ascii="Aptos" w:hAnsi="Aptos" w:cs="Arial"/>
+          <w:sz w:val="28"/>
+          <w:szCs w:val="28"/>
+        </w:rPr>
+        <w:t xml:space="preserve"> </w:t>
+      </w:r>
+      <w:proofErr w:type="spellStart"/>
+      <w:r>
+        <w:rPr>
+          <w:rFonts w:ascii="Aptos" w:hAnsi="Aptos" w:cs="Arial"/>
+          <w:sz w:val="28"/>
+          <w:szCs w:val="28"/>
+        </w:rPr>
+        <w:t>struktur</w:t>
+      </w:r>
+      <w:proofErr w:type="spellEnd"/>
+      <w:r>
+        <w:rPr>
+          <w:rFonts w:ascii="Aptos" w:hAnsi="Aptos" w:cs="Arial"/>
+          <w:sz w:val="28"/>
+          <w:szCs w:val="28"/>
+        </w:rPr>
+        <w:t xml:space="preserve"> file </w:t>
+      </w:r>
+      <w:proofErr w:type="spellStart"/>
+      <w:r>
+        <w:rPr>
+          <w:rFonts w:ascii="Aptos" w:hAnsi="Aptos" w:cs="Arial"/>
+          <w:sz w:val="28"/>
+          <w:szCs w:val="28"/>
+        </w:rPr>
+        <w:t>aplikasi</w:t>
+      </w:r>
+      <w:proofErr w:type="spellEnd"/>
+      <w:r>
+        <w:rPr>
+          <w:rFonts w:ascii="Aptos" w:hAnsi="Aptos" w:cs="Arial"/>
+          <w:sz w:val="28"/>
+          <w:szCs w:val="28"/>
+        </w:rPr>
+        <w:t xml:space="preserve"> React.</w:t>
       </w:r>
     </w:p>
     <w:p>
@@ -626,29 +1082,131 @@
           <w:szCs w:val="28"/>
         </w:rPr>
       </w:pPr>
-      <w:r>
-        <w:rPr>
-          <w:rFonts w:ascii="Aptos" w:hAnsi="Aptos" w:cs="Arial"/>
-          <w:sz w:val="28"/>
-          <w:szCs w:val="28"/>
-        </w:rPr>
-        <w:t>Menggunakan props untuk mengirim data antar component secara satu arah (one-way</w:t>
-      </w:r>
-      <w:r>
-        <w:rPr>
-          <w:rFonts w:ascii="Aptos" w:hAnsi="Aptos" w:cs="Arial"/>
-          <w:sz w:val="28"/>
-          <w:szCs w:val="28"/>
-        </w:rPr>
-        <w:t xml:space="preserve"> </w:t>
-      </w:r>
-      <w:r>
-        <w:rPr>
-          <w:rFonts w:ascii="Aptos" w:hAnsi="Aptos" w:cs="Arial"/>
-          <w:sz w:val="28"/>
-          <w:szCs w:val="28"/>
-        </w:rPr>
-        <w:t>data flow).</w:t>
+      <w:proofErr w:type="spellStart"/>
+      <w:r>
+        <w:rPr>
+          <w:rFonts w:ascii="Aptos" w:hAnsi="Aptos" w:cs="Arial"/>
+          <w:sz w:val="28"/>
+          <w:szCs w:val="28"/>
+        </w:rPr>
+        <w:t>Menggunakan</w:t>
+      </w:r>
+      <w:proofErr w:type="spellEnd"/>
+      <w:r>
+        <w:rPr>
+          <w:rFonts w:ascii="Aptos" w:hAnsi="Aptos" w:cs="Arial"/>
+          <w:sz w:val="28"/>
+          <w:szCs w:val="28"/>
+        </w:rPr>
+        <w:t xml:space="preserve"> props </w:t>
+      </w:r>
+      <w:proofErr w:type="spellStart"/>
+      <w:r>
+        <w:rPr>
+          <w:rFonts w:ascii="Aptos" w:hAnsi="Aptos" w:cs="Arial"/>
+          <w:sz w:val="28"/>
+          <w:szCs w:val="28"/>
+        </w:rPr>
+        <w:t>untuk</w:t>
+      </w:r>
+      <w:proofErr w:type="spellEnd"/>
+      <w:r>
+        <w:rPr>
+          <w:rFonts w:ascii="Aptos" w:hAnsi="Aptos" w:cs="Arial"/>
+          <w:sz w:val="28"/>
+          <w:szCs w:val="28"/>
+        </w:rPr>
+        <w:t xml:space="preserve"> </w:t>
+      </w:r>
+      <w:proofErr w:type="spellStart"/>
+      <w:r>
+        <w:rPr>
+          <w:rFonts w:ascii="Aptos" w:hAnsi="Aptos" w:cs="Arial"/>
+          <w:sz w:val="28"/>
+          <w:szCs w:val="28"/>
+        </w:rPr>
+        <w:t>mengirim</w:t>
+      </w:r>
+      <w:proofErr w:type="spellEnd"/>
+      <w:r>
+        <w:rPr>
+          <w:rFonts w:ascii="Aptos" w:hAnsi="Aptos" w:cs="Arial"/>
+          <w:sz w:val="28"/>
+          <w:szCs w:val="28"/>
+        </w:rPr>
+        <w:t xml:space="preserve"> data </w:t>
+      </w:r>
+      <w:proofErr w:type="spellStart"/>
+      <w:r>
+        <w:rPr>
+          <w:rFonts w:ascii="Aptos" w:hAnsi="Aptos" w:cs="Arial"/>
+          <w:sz w:val="28"/>
+          <w:szCs w:val="28"/>
+        </w:rPr>
+        <w:t>antar</w:t>
+      </w:r>
+      <w:proofErr w:type="spellEnd"/>
+      <w:r>
+        <w:rPr>
+          <w:rFonts w:ascii="Aptos" w:hAnsi="Aptos" w:cs="Arial"/>
+          <w:sz w:val="28"/>
+          <w:szCs w:val="28"/>
+        </w:rPr>
+        <w:t xml:space="preserve"> component </w:t>
+      </w:r>
+      <w:proofErr w:type="spellStart"/>
+      <w:r>
+        <w:rPr>
+          <w:rFonts w:ascii="Aptos" w:hAnsi="Aptos" w:cs="Arial"/>
+          <w:sz w:val="28"/>
+          <w:szCs w:val="28"/>
+        </w:rPr>
+        <w:t>secara</w:t>
+      </w:r>
+      <w:proofErr w:type="spellEnd"/>
+      <w:r>
+        <w:rPr>
+          <w:rFonts w:ascii="Aptos" w:hAnsi="Aptos" w:cs="Arial"/>
+          <w:sz w:val="28"/>
+          <w:szCs w:val="28"/>
+        </w:rPr>
+        <w:t xml:space="preserve"> </w:t>
+      </w:r>
+      <w:proofErr w:type="spellStart"/>
+      <w:r>
+        <w:rPr>
+          <w:rFonts w:ascii="Aptos" w:hAnsi="Aptos" w:cs="Arial"/>
+          <w:sz w:val="28"/>
+          <w:szCs w:val="28"/>
+        </w:rPr>
+        <w:t>satu</w:t>
+      </w:r>
+      <w:proofErr w:type="spellEnd"/>
+      <w:r>
+        <w:rPr>
+          <w:rFonts w:ascii="Aptos" w:hAnsi="Aptos" w:cs="Arial"/>
+          <w:sz w:val="28"/>
+          <w:szCs w:val="28"/>
+        </w:rPr>
+        <w:t xml:space="preserve"> </w:t>
+      </w:r>
+      <w:proofErr w:type="spellStart"/>
+      <w:r>
+        <w:rPr>
+          <w:rFonts w:ascii="Aptos" w:hAnsi="Aptos" w:cs="Arial"/>
+          <w:sz w:val="28"/>
+          <w:szCs w:val="28"/>
+        </w:rPr>
+        <w:t>arah</w:t>
+      </w:r>
+      <w:proofErr w:type="spellEnd"/>
+      <w:r>
+        <w:rPr>
+          <w:rFonts w:ascii="Aptos" w:hAnsi="Aptos" w:cs="Arial"/>
+          <w:sz w:val="28"/>
+          <w:szCs w:val="28"/>
+        </w:rPr>
+        <w:t xml:space="preserve"> (one-way data flow).</w:t>
       </w:r>
     </w:p>
     <w:p>
@@ -664,13 +1222,113 @@
           <w:szCs w:val="28"/>
         </w:rPr>
       </w:pPr>
-      <w:r>
-        <w:rPr>
-          <w:rFonts w:ascii="Aptos" w:hAnsi="Aptos" w:cs="Arial"/>
-          <w:sz w:val="28"/>
-          <w:szCs w:val="28"/>
-        </w:rPr>
-        <w:t>Mengelola state untuk membangun interaktivitas dasar pada aplikasi React.</w:t>
+      <w:proofErr w:type="spellStart"/>
+      <w:r>
+        <w:rPr>
+          <w:rFonts w:ascii="Aptos" w:hAnsi="Aptos" w:cs="Arial"/>
+          <w:sz w:val="28"/>
+          <w:szCs w:val="28"/>
+        </w:rPr>
+        <w:t>Mengelola</w:t>
+      </w:r>
+      <w:proofErr w:type="spellEnd"/>
+      <w:r>
+        <w:rPr>
+          <w:rFonts w:ascii="Aptos" w:hAnsi="Aptos" w:cs="Arial"/>
+          <w:sz w:val="28"/>
+          <w:szCs w:val="28"/>
+        </w:rPr>
+        <w:t xml:space="preserve"> state </w:t>
+      </w:r>
+      <w:proofErr w:type="spellStart"/>
+      <w:r>
+        <w:rPr>
+          <w:rFonts w:ascii="Aptos" w:hAnsi="Aptos" w:cs="Arial"/>
+          <w:sz w:val="28"/>
+          <w:szCs w:val="28"/>
+        </w:rPr>
+        <w:t>untuk</w:t>
+      </w:r>
+      <w:proofErr w:type="spellEnd"/>
+      <w:r>
+        <w:rPr>
+          <w:rFonts w:ascii="Aptos" w:hAnsi="Aptos" w:cs="Arial"/>
+          <w:sz w:val="28"/>
+          <w:szCs w:val="28"/>
+        </w:rPr>
+        <w:t xml:space="preserve"> </w:t>
+      </w:r>
+      <w:proofErr w:type="spellStart"/>
+      <w:r>
+        <w:rPr>
+          <w:rFonts w:ascii="Aptos" w:hAnsi="Aptos" w:cs="Arial"/>
+          <w:sz w:val="28"/>
+          <w:szCs w:val="28"/>
+        </w:rPr>
+        <w:t>membangun</w:t>
+      </w:r>
+      <w:proofErr w:type="spellEnd"/>
+      <w:r>
+        <w:rPr>
+          <w:rFonts w:ascii="Aptos" w:hAnsi="Aptos" w:cs="Arial"/>
+          <w:sz w:val="28"/>
+          <w:szCs w:val="28"/>
+        </w:rPr>
+        <w:t xml:space="preserve"> </w:t>
+      </w:r>
+      <w:proofErr w:type="spellStart"/>
+      <w:r>
+        <w:rPr>
+          <w:rFonts w:ascii="Aptos" w:hAnsi="Aptos" w:cs="Arial"/>
+          <w:sz w:val="28"/>
+          <w:szCs w:val="28"/>
+        </w:rPr>
+        <w:t>interaktivitas</w:t>
+      </w:r>
+      <w:proofErr w:type="spellEnd"/>
+      <w:r>
+        <w:rPr>
+          <w:rFonts w:ascii="Aptos" w:hAnsi="Aptos" w:cs="Arial"/>
+          <w:sz w:val="28"/>
+          <w:szCs w:val="28"/>
+        </w:rPr>
+        <w:t xml:space="preserve"> </w:t>
+      </w:r>
+      <w:proofErr w:type="spellStart"/>
+      <w:r>
+        <w:rPr>
+          <w:rFonts w:ascii="Aptos" w:hAnsi="Aptos" w:cs="Arial"/>
+          <w:sz w:val="28"/>
+          <w:szCs w:val="28"/>
+        </w:rPr>
+        <w:t>dasar</w:t>
+      </w:r>
+      <w:proofErr w:type="spellEnd"/>
+      <w:r>
+        <w:rPr>
+          <w:rFonts w:ascii="Aptos" w:hAnsi="Aptos" w:cs="Arial"/>
+          <w:sz w:val="28"/>
+          <w:szCs w:val="28"/>
+        </w:rPr>
+        <w:t xml:space="preserve"> pada </w:t>
+      </w:r>
+      <w:proofErr w:type="spellStart"/>
+      <w:r>
+        <w:rPr>
+          <w:rFonts w:ascii="Aptos" w:hAnsi="Aptos" w:cs="Arial"/>
+          <w:sz w:val="28"/>
+          <w:szCs w:val="28"/>
+        </w:rPr>
+        <w:t>aplikasi</w:t>
+      </w:r>
+      <w:proofErr w:type="spellEnd"/>
+      <w:r>
+        <w:rPr>
+          <w:rFonts w:ascii="Aptos" w:hAnsi="Aptos" w:cs="Arial"/>
+          <w:sz w:val="28"/>
+          <w:szCs w:val="28"/>
+        </w:rPr>
+        <w:t xml:space="preserve"> React.</w:t>
       </w:r>
     </w:p>
     <w:p>
@@ -686,29 +1344,95 @@
           <w:szCs w:val="28"/>
         </w:rPr>
       </w:pPr>
-      <w:r>
-        <w:rPr>
-          <w:rFonts w:ascii="Aptos" w:hAnsi="Aptos" w:cs="Arial"/>
-          <w:sz w:val="28"/>
-          <w:szCs w:val="28"/>
-        </w:rPr>
-        <w:t>Melakukan rendering list dan conditional rendering untuk menampilkan data secara</w:t>
-      </w:r>
-      <w:r>
-        <w:rPr>
-          <w:rFonts w:ascii="Aptos" w:hAnsi="Aptos" w:cs="Arial"/>
-          <w:sz w:val="28"/>
-          <w:szCs w:val="28"/>
-        </w:rPr>
-        <w:t xml:space="preserve"> </w:t>
-      </w:r>
-      <w:r>
-        <w:rPr>
-          <w:rFonts w:ascii="Aptos" w:hAnsi="Aptos" w:cs="Arial"/>
-          <w:sz w:val="28"/>
-          <w:szCs w:val="28"/>
-        </w:rPr>
-        <w:t>dinamis.</w:t>
+      <w:proofErr w:type="spellStart"/>
+      <w:r>
+        <w:rPr>
+          <w:rFonts w:ascii="Aptos" w:hAnsi="Aptos" w:cs="Arial"/>
+          <w:sz w:val="28"/>
+          <w:szCs w:val="28"/>
+        </w:rPr>
+        <w:t>Melakukan</w:t>
+      </w:r>
+      <w:proofErr w:type="spellEnd"/>
+      <w:r>
+        <w:rPr>
+          <w:rFonts w:ascii="Aptos" w:hAnsi="Aptos" w:cs="Arial"/>
+          <w:sz w:val="28"/>
+          <w:szCs w:val="28"/>
+        </w:rPr>
+        <w:t xml:space="preserve"> rendering list dan conditional rendering </w:t>
+      </w:r>
+      <w:proofErr w:type="spellStart"/>
+      <w:r>
+        <w:rPr>
+          <w:rFonts w:ascii="Aptos" w:hAnsi="Aptos" w:cs="Arial"/>
+          <w:sz w:val="28"/>
+          <w:szCs w:val="28"/>
+        </w:rPr>
+        <w:t>untuk</w:t>
+      </w:r>
+      <w:proofErr w:type="spellEnd"/>
+      <w:r>
+        <w:rPr>
+          <w:rFonts w:ascii="Aptos" w:hAnsi="Aptos" w:cs="Arial"/>
+          <w:sz w:val="28"/>
+          <w:szCs w:val="28"/>
+        </w:rPr>
+        <w:t xml:space="preserve"> </w:t>
+      </w:r>
+      <w:proofErr w:type="spellStart"/>
+      <w:r>
+        <w:rPr>
+          <w:rFonts w:ascii="Aptos" w:hAnsi="Aptos" w:cs="Arial"/>
+          <w:sz w:val="28"/>
+          <w:szCs w:val="28"/>
+        </w:rPr>
+        <w:t>menampilkan</w:t>
+      </w:r>
+      <w:proofErr w:type="spellEnd"/>
+      <w:r>
+        <w:rPr>
+          <w:rFonts w:ascii="Aptos" w:hAnsi="Aptos" w:cs="Arial"/>
+          <w:sz w:val="28"/>
+          <w:szCs w:val="28"/>
+        </w:rPr>
+        <w:t xml:space="preserve"> data </w:t>
+      </w:r>
+      <w:proofErr w:type="spellStart"/>
+      <w:r>
+        <w:rPr>
+          <w:rFonts w:ascii="Aptos" w:hAnsi="Aptos" w:cs="Arial"/>
+          <w:sz w:val="28"/>
+          <w:szCs w:val="28"/>
+        </w:rPr>
+        <w:t>secara</w:t>
+      </w:r>
+      <w:proofErr w:type="spellEnd"/>
+      <w:r>
+        <w:rPr>
+          <w:rFonts w:ascii="Aptos" w:hAnsi="Aptos" w:cs="Arial"/>
+          <w:sz w:val="28"/>
+          <w:szCs w:val="28"/>
+        </w:rPr>
+        <w:t xml:space="preserve"> </w:t>
+      </w:r>
+      <w:proofErr w:type="spellStart"/>
+      <w:r>
+        <w:rPr>
+          <w:rFonts w:ascii="Aptos" w:hAnsi="Aptos" w:cs="Arial"/>
+          <w:sz w:val="28"/>
+          <w:szCs w:val="28"/>
+        </w:rPr>
+        <w:t>dinamis</w:t>
+      </w:r>
+      <w:proofErr w:type="spellEnd"/>
+      <w:r>
+        <w:rPr>
+          <w:rFonts w:ascii="Aptos" w:hAnsi="Aptos" w:cs="Arial"/>
+          <w:sz w:val="28"/>
+          <w:szCs w:val="28"/>
+        </w:rPr>
+        <w:t>.</w:t>
       </w:r>
     </w:p>
     <w:p>
@@ -724,29 +1448,131 @@
           <w:szCs w:val="28"/>
         </w:rPr>
       </w:pPr>
-      <w:r>
-        <w:rPr>
-          <w:rFonts w:ascii="Aptos" w:hAnsi="Aptos" w:cs="Arial"/>
-          <w:sz w:val="28"/>
-          <w:szCs w:val="28"/>
-        </w:rPr>
-        <w:t>Membangun aplikasi React sederhana yang menerapkan component, props, state, dan</w:t>
-      </w:r>
-      <w:r>
-        <w:rPr>
-          <w:rFonts w:ascii="Aptos" w:hAnsi="Aptos" w:cs="Arial"/>
-          <w:sz w:val="28"/>
-          <w:szCs w:val="28"/>
-        </w:rPr>
-        <w:t xml:space="preserve"> </w:t>
-      </w:r>
-      <w:r>
-        <w:rPr>
-          <w:rFonts w:ascii="Aptos" w:hAnsi="Aptos" w:cs="Arial"/>
-          <w:sz w:val="28"/>
-          <w:szCs w:val="28"/>
-        </w:rPr>
-        <w:t>rendering dinamis secara terstruktur.</w:t>
+      <w:proofErr w:type="spellStart"/>
+      <w:r>
+        <w:rPr>
+          <w:rFonts w:ascii="Aptos" w:hAnsi="Aptos" w:cs="Arial"/>
+          <w:sz w:val="28"/>
+          <w:szCs w:val="28"/>
+        </w:rPr>
+        <w:t>Membangun</w:t>
+      </w:r>
+      <w:proofErr w:type="spellEnd"/>
+      <w:r>
+        <w:rPr>
+          <w:rFonts w:ascii="Aptos" w:hAnsi="Aptos" w:cs="Arial"/>
+          <w:sz w:val="28"/>
+          <w:szCs w:val="28"/>
+        </w:rPr>
+        <w:t xml:space="preserve"> </w:t>
+      </w:r>
+      <w:proofErr w:type="spellStart"/>
+      <w:r>
+        <w:rPr>
+          <w:rFonts w:ascii="Aptos" w:hAnsi="Aptos" w:cs="Arial"/>
+          <w:sz w:val="28"/>
+          <w:szCs w:val="28"/>
+        </w:rPr>
+        <w:t>aplikasi</w:t>
+      </w:r>
+      <w:proofErr w:type="spellEnd"/>
+      <w:r>
+        <w:rPr>
+          <w:rFonts w:ascii="Aptos" w:hAnsi="Aptos" w:cs="Arial"/>
+          <w:sz w:val="28"/>
+          <w:szCs w:val="28"/>
+        </w:rPr>
+        <w:t xml:space="preserve"> React </w:t>
+      </w:r>
+      <w:proofErr w:type="spellStart"/>
+      <w:r>
+        <w:rPr>
+          <w:rFonts w:ascii="Aptos" w:hAnsi="Aptos" w:cs="Arial"/>
+          <w:sz w:val="28"/>
+          <w:szCs w:val="28"/>
+        </w:rPr>
+        <w:t>sederhana</w:t>
+      </w:r>
+      <w:proofErr w:type="spellEnd"/>
+      <w:r>
+        <w:rPr>
+          <w:rFonts w:ascii="Aptos" w:hAnsi="Aptos" w:cs="Arial"/>
+          <w:sz w:val="28"/>
+          <w:szCs w:val="28"/>
+        </w:rPr>
+        <w:t xml:space="preserve"> yang </w:t>
+      </w:r>
+      <w:proofErr w:type="spellStart"/>
+      <w:r>
+        <w:rPr>
+          <w:rFonts w:ascii="Aptos" w:hAnsi="Aptos" w:cs="Arial"/>
+          <w:sz w:val="28"/>
+          <w:szCs w:val="28"/>
+        </w:rPr>
+        <w:t>menerapkan</w:t>
+      </w:r>
+      <w:proofErr w:type="spellEnd"/>
+      <w:r>
+        <w:rPr>
+          <w:rFonts w:ascii="Aptos" w:hAnsi="Aptos" w:cs="Arial"/>
+          <w:sz w:val="28"/>
+          <w:szCs w:val="28"/>
+        </w:rPr>
+        <w:t xml:space="preserve"> component, props, state, dan rendering </w:t>
+      </w:r>
+      <w:proofErr w:type="spellStart"/>
+      <w:r>
+        <w:rPr>
+          <w:rFonts w:ascii="Aptos" w:hAnsi="Aptos" w:cs="Arial"/>
+          <w:sz w:val="28"/>
+          <w:szCs w:val="28"/>
+        </w:rPr>
+        <w:t>dinamis</w:t>
+      </w:r>
+      <w:proofErr w:type="spellEnd"/>
+      <w:r>
+        <w:rPr>
+          <w:rFonts w:ascii="Aptos" w:hAnsi="Aptos" w:cs="Arial"/>
+          <w:sz w:val="28"/>
+          <w:szCs w:val="28"/>
+        </w:rPr>
+        <w:t xml:space="preserve"> </w:t>
+      </w:r>
+      <w:proofErr w:type="spellStart"/>
+      <w:r>
+        <w:rPr>
+          <w:rFonts w:ascii="Aptos" w:hAnsi="Aptos" w:cs="Arial"/>
+          <w:sz w:val="28"/>
+          <w:szCs w:val="28"/>
+        </w:rPr>
+        <w:t>secara</w:t>
+      </w:r>
+      <w:proofErr w:type="spellEnd"/>
+      <w:r>
+        <w:rPr>
+          <w:rFonts w:ascii="Aptos" w:hAnsi="Aptos" w:cs="Arial"/>
+          <w:sz w:val="28"/>
+          <w:szCs w:val="28"/>
+        </w:rPr>
+        <w:t xml:space="preserve"> </w:t>
+      </w:r>
+      <w:proofErr w:type="spellStart"/>
+      <w:r>
+        <w:rPr>
+          <w:rFonts w:ascii="Aptos" w:hAnsi="Aptos" w:cs="Arial"/>
+          <w:sz w:val="28"/>
+          <w:szCs w:val="28"/>
+        </w:rPr>
+        <w:t>terstruktur</w:t>
+      </w:r>
+      <w:proofErr w:type="spellEnd"/>
+      <w:r>
+        <w:rPr>
+          <w:rFonts w:ascii="Aptos" w:hAnsi="Aptos" w:cs="Arial"/>
+          <w:sz w:val="28"/>
+          <w:szCs w:val="28"/>
+        </w:rPr>
+        <w:t>.</w:t>
       </w:r>
     </w:p>
     <w:p>
@@ -803,13 +1629,113 @@
           <w:szCs w:val="28"/>
         </w:rPr>
       </w:pPr>
-      <w:r>
-        <w:rPr>
-          <w:rFonts w:ascii="Aptos" w:hAnsi="Aptos" w:cs="Arial"/>
-          <w:sz w:val="28"/>
-          <w:szCs w:val="28"/>
-        </w:rPr>
-        <w:t>Berikut alat dan bahan yang digunakan dalam praktikum:</w:t>
+      <w:proofErr w:type="spellStart"/>
+      <w:r>
+        <w:rPr>
+          <w:rFonts w:ascii="Aptos" w:hAnsi="Aptos" w:cs="Arial"/>
+          <w:sz w:val="28"/>
+          <w:szCs w:val="28"/>
+        </w:rPr>
+        <w:t>Berikut</w:t>
+      </w:r>
+      <w:proofErr w:type="spellEnd"/>
+      <w:r>
+        <w:rPr>
+          <w:rFonts w:ascii="Aptos" w:hAnsi="Aptos" w:cs="Arial"/>
+          <w:sz w:val="28"/>
+          <w:szCs w:val="28"/>
+        </w:rPr>
+        <w:t xml:space="preserve"> </w:t>
+      </w:r>
+      <w:proofErr w:type="spellStart"/>
+      <w:r>
+        <w:rPr>
+          <w:rFonts w:ascii="Aptos" w:hAnsi="Aptos" w:cs="Arial"/>
+          <w:sz w:val="28"/>
+          <w:szCs w:val="28"/>
+        </w:rPr>
+        <w:t>alat</w:t>
+      </w:r>
+      <w:proofErr w:type="spellEnd"/>
+      <w:r>
+        <w:rPr>
+          <w:rFonts w:ascii="Aptos" w:hAnsi="Aptos" w:cs="Arial"/>
+          <w:sz w:val="28"/>
+          <w:szCs w:val="28"/>
+        </w:rPr>
+        <w:t xml:space="preserve"> dan </w:t>
+      </w:r>
+      <w:proofErr w:type="spellStart"/>
+      <w:r>
+        <w:rPr>
+          <w:rFonts w:ascii="Aptos" w:hAnsi="Aptos" w:cs="Arial"/>
+          <w:sz w:val="28"/>
+          <w:szCs w:val="28"/>
+        </w:rPr>
+        <w:t>bahan</w:t>
+      </w:r>
+      <w:proofErr w:type="spellEnd"/>
+      <w:r>
+        <w:rPr>
+          <w:rFonts w:ascii="Aptos" w:hAnsi="Aptos" w:cs="Arial"/>
+          <w:sz w:val="28"/>
+          <w:szCs w:val="28"/>
+        </w:rPr>
+        <w:t xml:space="preserve"> yang </w:t>
+      </w:r>
+      <w:proofErr w:type="spellStart"/>
+      <w:r>
+        <w:rPr>
+          <w:rFonts w:ascii="Aptos" w:hAnsi="Aptos" w:cs="Arial"/>
+          <w:sz w:val="28"/>
+          <w:szCs w:val="28"/>
+        </w:rPr>
+        <w:t>digunakan</w:t>
+      </w:r>
+      <w:proofErr w:type="spellEnd"/>
+      <w:r>
+        <w:rPr>
+          <w:rFonts w:ascii="Aptos" w:hAnsi="Aptos" w:cs="Arial"/>
+          <w:sz w:val="28"/>
+          <w:szCs w:val="28"/>
+        </w:rPr>
+        <w:t xml:space="preserve"> </w:t>
+      </w:r>
+      <w:proofErr w:type="spellStart"/>
+      <w:r>
+        <w:rPr>
+          <w:rFonts w:ascii="Aptos" w:hAnsi="Aptos" w:cs="Arial"/>
+          <w:sz w:val="28"/>
+          <w:szCs w:val="28"/>
+        </w:rPr>
+        <w:t>dalam</w:t>
+      </w:r>
+      <w:proofErr w:type="spellEnd"/>
+      <w:r>
+        <w:rPr>
+          <w:rFonts w:ascii="Aptos" w:hAnsi="Aptos" w:cs="Arial"/>
+          <w:sz w:val="28"/>
+          <w:szCs w:val="28"/>
+        </w:rPr>
+        <w:t xml:space="preserve"> </w:t>
+      </w:r>
+      <w:proofErr w:type="spellStart"/>
+      <w:r>
+        <w:rPr>
+          <w:rFonts w:ascii="Aptos" w:hAnsi="Aptos" w:cs="Arial"/>
+          <w:sz w:val="28"/>
+          <w:szCs w:val="28"/>
+        </w:rPr>
+        <w:t>praktikum</w:t>
+      </w:r>
+      <w:proofErr w:type="spellEnd"/>
+      <w:r>
+        <w:rPr>
+          <w:rFonts w:ascii="Aptos" w:hAnsi="Aptos" w:cs="Arial"/>
+          <w:sz w:val="28"/>
+          <w:szCs w:val="28"/>
+        </w:rPr>
+        <w:t>:</w:t>
       </w:r>
     </w:p>
     <w:p>
@@ -841,7 +1767,97 @@
           <w:sz w:val="28"/>
           <w:szCs w:val="28"/>
         </w:rPr>
-        <w:t xml:space="preserve"> → Digunakan sebagai runtime JavaScript untuk menjalankan React dan npm. </w:t>
+        <w:t xml:space="preserve"> → </w:t>
+      </w:r>
+      <w:proofErr w:type="spellStart"/>
+      <w:r>
+        <w:rPr>
+          <w:rFonts w:ascii="Aptos" w:hAnsi="Aptos" w:cs="Arial"/>
+          <w:sz w:val="28"/>
+          <w:szCs w:val="28"/>
+        </w:rPr>
+        <w:t>Digunakan</w:t>
+      </w:r>
+      <w:proofErr w:type="spellEnd"/>
+      <w:r>
+        <w:rPr>
+          <w:rFonts w:ascii="Aptos" w:hAnsi="Aptos" w:cs="Arial"/>
+          <w:sz w:val="28"/>
+          <w:szCs w:val="28"/>
+        </w:rPr>
+        <w:t xml:space="preserve"> </w:t>
+      </w:r>
+      <w:proofErr w:type="spellStart"/>
+      <w:r>
+        <w:rPr>
+          <w:rFonts w:ascii="Aptos" w:hAnsi="Aptos" w:cs="Arial"/>
+          <w:sz w:val="28"/>
+          <w:szCs w:val="28"/>
+        </w:rPr>
+        <w:t>sebagai</w:t>
+      </w:r>
+      <w:proofErr w:type="spellEnd"/>
+      <w:r>
+        <w:rPr>
+          <w:rFonts w:ascii="Aptos" w:hAnsi="Aptos" w:cs="Arial"/>
+          <w:sz w:val="28"/>
+          <w:szCs w:val="28"/>
+        </w:rPr>
+        <w:t xml:space="preserve"> runtime JavaScript </w:t>
+      </w:r>
+      <w:proofErr w:type="spellStart"/>
+      <w:r>
+        <w:rPr>
+          <w:rFonts w:ascii="Aptos" w:hAnsi="Aptos" w:cs="Arial"/>
+          <w:sz w:val="28"/>
+          <w:szCs w:val="28"/>
+        </w:rPr>
+        <w:t>untuk</w:t>
+      </w:r>
+      <w:proofErr w:type="spellEnd"/>
+      <w:r>
+        <w:rPr>
+          <w:rFonts w:ascii="Aptos" w:hAnsi="Aptos" w:cs="Arial"/>
+          <w:sz w:val="28"/>
+          <w:szCs w:val="28"/>
+        </w:rPr>
+        <w:t xml:space="preserve"> </w:t>
+      </w:r>
+      <w:proofErr w:type="spellStart"/>
+      <w:r>
+        <w:rPr>
+          <w:rFonts w:ascii="Aptos" w:hAnsi="Aptos" w:cs="Arial"/>
+          <w:sz w:val="28"/>
+          <w:szCs w:val="28"/>
+        </w:rPr>
+        <w:t>menjalankan</w:t>
+      </w:r>
+      <w:proofErr w:type="spellEnd"/>
+      <w:r>
+        <w:rPr>
+          <w:rFonts w:ascii="Aptos" w:hAnsi="Aptos" w:cs="Arial"/>
+          <w:sz w:val="28"/>
+          <w:szCs w:val="28"/>
+        </w:rPr>
+        <w:t xml:space="preserve"> React dan </w:t>
+      </w:r>
+      <w:proofErr w:type="spellStart"/>
+      <w:r>
+        <w:rPr>
+          <w:rFonts w:ascii="Aptos" w:hAnsi="Aptos" w:cs="Arial"/>
+          <w:sz w:val="28"/>
+          <w:szCs w:val="28"/>
+        </w:rPr>
+        <w:t>npm</w:t>
+      </w:r>
+      <w:proofErr w:type="spellEnd"/>
+      <w:r>
+        <w:rPr>
+          <w:rFonts w:ascii="Aptos" w:hAnsi="Aptos" w:cs="Arial"/>
+          <w:sz w:val="28"/>
+          <w:szCs w:val="28"/>
+        </w:rPr>
+        <w:t xml:space="preserve">. </w:t>
       </w:r>
     </w:p>
     <w:p>
@@ -865,15 +1881,127 @@
           <w:sz w:val="28"/>
           <w:szCs w:val="28"/>
         </w:rPr>
-        <w:t>Package Manager (npm/yarn)</w:t>
-      </w:r>
-      <w:r>
-        <w:rPr>
-          <w:rFonts w:ascii="Aptos" w:hAnsi="Aptos" w:cs="Arial"/>
-          <w:sz w:val="28"/>
-          <w:szCs w:val="28"/>
-        </w:rPr>
-        <w:t xml:space="preserve"> → Digunakan untuk mengelola dependensi proyek. </w:t>
+        <w:t>Package Manager (</w:t>
+      </w:r>
+      <w:proofErr w:type="spellStart"/>
+      <w:r>
+        <w:rPr>
+          <w:rFonts w:ascii="Aptos" w:hAnsi="Aptos" w:cs="Arial"/>
+          <w:b/>
+          <w:bCs/>
+          <w:sz w:val="28"/>
+          <w:szCs w:val="28"/>
+        </w:rPr>
+        <w:t>npm</w:t>
+      </w:r>
+      <w:proofErr w:type="spellEnd"/>
+      <w:r>
+        <w:rPr>
+          <w:rFonts w:ascii="Aptos" w:hAnsi="Aptos" w:cs="Arial"/>
+          <w:b/>
+          <w:bCs/>
+          <w:sz w:val="28"/>
+          <w:szCs w:val="28"/>
+        </w:rPr>
+        <w:t>/yarn)</w:t>
+      </w:r>
+      <w:r>
+        <w:rPr>
+          <w:rFonts w:ascii="Aptos" w:hAnsi="Aptos" w:cs="Arial"/>
+          <w:sz w:val="28"/>
+          <w:szCs w:val="28"/>
+        </w:rPr>
+        <w:t xml:space="preserve"> → </w:t>
+      </w:r>
+      <w:proofErr w:type="spellStart"/>
+      <w:r>
+        <w:rPr>
+          <w:rFonts w:ascii="Aptos" w:hAnsi="Aptos" w:cs="Arial"/>
+          <w:sz w:val="28"/>
+          <w:szCs w:val="28"/>
+        </w:rPr>
+        <w:t>Digunakan</w:t>
+      </w:r>
+      <w:proofErr w:type="spellEnd"/>
+      <w:r>
+        <w:rPr>
+          <w:rFonts w:ascii="Aptos" w:hAnsi="Aptos" w:cs="Arial"/>
+          <w:sz w:val="28"/>
+          <w:szCs w:val="28"/>
+        </w:rPr>
+        <w:t xml:space="preserve"> </w:t>
+      </w:r>
+      <w:proofErr w:type="spellStart"/>
+      <w:r>
+        <w:rPr>
+          <w:rFonts w:ascii="Aptos" w:hAnsi="Aptos" w:cs="Arial"/>
+          <w:sz w:val="28"/>
+          <w:szCs w:val="28"/>
+        </w:rPr>
+        <w:t>untuk</w:t>
+      </w:r>
+      <w:proofErr w:type="spellEnd"/>
+      <w:r>
+        <w:rPr>
+          <w:rFonts w:ascii="Aptos" w:hAnsi="Aptos" w:cs="Arial"/>
+          <w:sz w:val="28"/>
+          <w:szCs w:val="28"/>
+        </w:rPr>
+        <w:t xml:space="preserve"> </w:t>
+      </w:r>
+      <w:proofErr w:type="spellStart"/>
+      <w:r>
+        <w:rPr>
+          <w:rFonts w:ascii="Aptos" w:hAnsi="Aptos" w:cs="Arial"/>
+          <w:sz w:val="28"/>
+          <w:szCs w:val="28"/>
+        </w:rPr>
+        <w:t>mengelola</w:t>
+      </w:r>
+      <w:proofErr w:type="spellEnd"/>
+      <w:r>
+        <w:rPr>
+          <w:rFonts w:ascii="Aptos" w:hAnsi="Aptos" w:cs="Arial"/>
+          <w:sz w:val="28"/>
+          <w:szCs w:val="28"/>
+        </w:rPr>
+        <w:t xml:space="preserve"> </w:t>
+      </w:r>
+      <w:proofErr w:type="spellStart"/>
+      <w:r>
+        <w:rPr>
+          <w:rFonts w:ascii="Aptos" w:hAnsi="Aptos" w:cs="Arial"/>
+          <w:sz w:val="28"/>
+          <w:szCs w:val="28"/>
+        </w:rPr>
+        <w:t>dependensi</w:t>
+      </w:r>
+      <w:proofErr w:type="spellEnd"/>
+      <w:r>
+        <w:rPr>
+          <w:rFonts w:ascii="Aptos" w:hAnsi="Aptos" w:cs="Arial"/>
+          <w:sz w:val="28"/>
+          <w:szCs w:val="28"/>
+        </w:rPr>
+        <w:t xml:space="preserve"> </w:t>
+      </w:r>
+      <w:proofErr w:type="spellStart"/>
+      <w:r>
+        <w:rPr>
+          <w:rFonts w:ascii="Aptos" w:hAnsi="Aptos" w:cs="Arial"/>
+          <w:sz w:val="28"/>
+          <w:szCs w:val="28"/>
+        </w:rPr>
+        <w:t>proyek</w:t>
+      </w:r>
+      <w:proofErr w:type="spellEnd"/>
+      <w:r>
+        <w:rPr>
+          <w:rFonts w:ascii="Aptos" w:hAnsi="Aptos" w:cs="Arial"/>
+          <w:sz w:val="28"/>
+          <w:szCs w:val="28"/>
+        </w:rPr>
+        <w:t xml:space="preserve">. </w:t>
       </w:r>
     </w:p>
     <w:p>
@@ -905,7 +2033,133 @@
           <w:sz w:val="28"/>
           <w:szCs w:val="28"/>
         </w:rPr>
-        <w:t xml:space="preserve"> → Digunakan untuk membangun antarmuka pengguna berbasis komponen. </w:t>
+        <w:t xml:space="preserve"> → </w:t>
+      </w:r>
+      <w:proofErr w:type="spellStart"/>
+      <w:r>
+        <w:rPr>
+          <w:rFonts w:ascii="Aptos" w:hAnsi="Aptos" w:cs="Arial"/>
+          <w:sz w:val="28"/>
+          <w:szCs w:val="28"/>
+        </w:rPr>
+        <w:t>Digunakan</w:t>
+      </w:r>
+      <w:proofErr w:type="spellEnd"/>
+      <w:r>
+        <w:rPr>
+          <w:rFonts w:ascii="Aptos" w:hAnsi="Aptos" w:cs="Arial"/>
+          <w:sz w:val="28"/>
+          <w:szCs w:val="28"/>
+        </w:rPr>
+        <w:t xml:space="preserve"> </w:t>
+      </w:r>
+      <w:proofErr w:type="spellStart"/>
+      <w:r>
+        <w:rPr>
+          <w:rFonts w:ascii="Aptos" w:hAnsi="Aptos" w:cs="Arial"/>
+          <w:sz w:val="28"/>
+          <w:szCs w:val="28"/>
+        </w:rPr>
+        <w:t>untuk</w:t>
+      </w:r>
+      <w:proofErr w:type="spellEnd"/>
+      <w:r>
+        <w:rPr>
+          <w:rFonts w:ascii="Aptos" w:hAnsi="Aptos" w:cs="Arial"/>
+          <w:sz w:val="28"/>
+          <w:szCs w:val="28"/>
+        </w:rPr>
+        <w:t xml:space="preserve"> </w:t>
+      </w:r>
+      <w:proofErr w:type="spellStart"/>
+      <w:r>
+        <w:rPr>
+          <w:rFonts w:ascii="Aptos" w:hAnsi="Aptos" w:cs="Arial"/>
+          <w:sz w:val="28"/>
+          <w:szCs w:val="28"/>
+        </w:rPr>
+        <w:t>membangun</w:t>
+      </w:r>
+      <w:proofErr w:type="spellEnd"/>
+      <w:r>
+        <w:rPr>
+          <w:rFonts w:ascii="Aptos" w:hAnsi="Aptos" w:cs="Arial"/>
+          <w:sz w:val="28"/>
+          <w:szCs w:val="28"/>
+        </w:rPr>
+        <w:t xml:space="preserve"> </w:t>
+      </w:r>
+      <w:proofErr w:type="spellStart"/>
+      <w:r>
+        <w:rPr>
+          <w:rFonts w:ascii="Aptos" w:hAnsi="Aptos" w:cs="Arial"/>
+          <w:sz w:val="28"/>
+          <w:szCs w:val="28"/>
+        </w:rPr>
+        <w:t>antarmuka</w:t>
+      </w:r>
+      <w:proofErr w:type="spellEnd"/>
+      <w:r>
+        <w:rPr>
+          <w:rFonts w:ascii="Aptos" w:hAnsi="Aptos" w:cs="Arial"/>
+          <w:sz w:val="28"/>
+          <w:szCs w:val="28"/>
+        </w:rPr>
+        <w:t xml:space="preserve"> </w:t>
+      </w:r>
+      <w:proofErr w:type="spellStart"/>
+      <w:r>
+        <w:rPr>
+          <w:rFonts w:ascii="Aptos" w:hAnsi="Aptos" w:cs="Arial"/>
+          <w:sz w:val="28"/>
+          <w:szCs w:val="28"/>
+        </w:rPr>
+        <w:t>pengguna</w:t>
+      </w:r>
+      <w:proofErr w:type="spellEnd"/>
+      <w:r>
+        <w:rPr>
+          <w:rFonts w:ascii="Aptos" w:hAnsi="Aptos" w:cs="Arial"/>
+          <w:sz w:val="28"/>
+          <w:szCs w:val="28"/>
+        </w:rPr>
+        <w:t xml:space="preserve"> </w:t>
+      </w:r>
+      <w:proofErr w:type="spellStart"/>
+      <w:r>
+        <w:rPr>
+          <w:rFonts w:ascii="Aptos" w:hAnsi="Aptos" w:cs="Arial"/>
+          <w:sz w:val="28"/>
+          <w:szCs w:val="28"/>
+        </w:rPr>
+        <w:t>berbasis</w:t>
+      </w:r>
+      <w:proofErr w:type="spellEnd"/>
+      <w:r>
+        <w:rPr>
+          <w:rFonts w:ascii="Aptos" w:hAnsi="Aptos" w:cs="Arial"/>
+          <w:sz w:val="28"/>
+          <w:szCs w:val="28"/>
+        </w:rPr>
+        <w:t xml:space="preserve"> </w:t>
+      </w:r>
+      <w:proofErr w:type="spellStart"/>
+      <w:r>
+        <w:rPr>
+          <w:rFonts w:ascii="Aptos" w:hAnsi="Aptos" w:cs="Arial"/>
+          <w:sz w:val="28"/>
+          <w:szCs w:val="28"/>
+        </w:rPr>
+        <w:t>komponen</w:t>
+      </w:r>
+      <w:proofErr w:type="spellEnd"/>
+      <w:r>
+        <w:rPr>
+          <w:rFonts w:ascii="Aptos" w:hAnsi="Aptos" w:cs="Arial"/>
+          <w:sz w:val="28"/>
+          <w:szCs w:val="28"/>
+        </w:rPr>
+        <w:t xml:space="preserve">. </w:t>
       </w:r>
     </w:p>
     <w:p>
@@ -937,7 +2191,97 @@
           <w:sz w:val="28"/>
           <w:szCs w:val="28"/>
         </w:rPr>
-        <w:t xml:space="preserve"> → Digunakan untuk membuat dan menjalankan proyek React. </w:t>
+        <w:t xml:space="preserve"> → </w:t>
+      </w:r>
+      <w:proofErr w:type="spellStart"/>
+      <w:r>
+        <w:rPr>
+          <w:rFonts w:ascii="Aptos" w:hAnsi="Aptos" w:cs="Arial"/>
+          <w:sz w:val="28"/>
+          <w:szCs w:val="28"/>
+        </w:rPr>
+        <w:t>Digunakan</w:t>
+      </w:r>
+      <w:proofErr w:type="spellEnd"/>
+      <w:r>
+        <w:rPr>
+          <w:rFonts w:ascii="Aptos" w:hAnsi="Aptos" w:cs="Arial"/>
+          <w:sz w:val="28"/>
+          <w:szCs w:val="28"/>
+        </w:rPr>
+        <w:t xml:space="preserve"> </w:t>
+      </w:r>
+      <w:proofErr w:type="spellStart"/>
+      <w:r>
+        <w:rPr>
+          <w:rFonts w:ascii="Aptos" w:hAnsi="Aptos" w:cs="Arial"/>
+          <w:sz w:val="28"/>
+          <w:szCs w:val="28"/>
+        </w:rPr>
+        <w:t>untuk</w:t>
+      </w:r>
+      <w:proofErr w:type="spellEnd"/>
+      <w:r>
+        <w:rPr>
+          <w:rFonts w:ascii="Aptos" w:hAnsi="Aptos" w:cs="Arial"/>
+          <w:sz w:val="28"/>
+          <w:szCs w:val="28"/>
+        </w:rPr>
+        <w:t xml:space="preserve"> </w:t>
+      </w:r>
+      <w:proofErr w:type="spellStart"/>
+      <w:r>
+        <w:rPr>
+          <w:rFonts w:ascii="Aptos" w:hAnsi="Aptos" w:cs="Arial"/>
+          <w:sz w:val="28"/>
+          <w:szCs w:val="28"/>
+        </w:rPr>
+        <w:t>membuat</w:t>
+      </w:r>
+      <w:proofErr w:type="spellEnd"/>
+      <w:r>
+        <w:rPr>
+          <w:rFonts w:ascii="Aptos" w:hAnsi="Aptos" w:cs="Arial"/>
+          <w:sz w:val="28"/>
+          <w:szCs w:val="28"/>
+        </w:rPr>
+        <w:t xml:space="preserve"> dan </w:t>
+      </w:r>
+      <w:proofErr w:type="spellStart"/>
+      <w:r>
+        <w:rPr>
+          <w:rFonts w:ascii="Aptos" w:hAnsi="Aptos" w:cs="Arial"/>
+          <w:sz w:val="28"/>
+          <w:szCs w:val="28"/>
+        </w:rPr>
+        <w:t>menjalankan</w:t>
+      </w:r>
+      <w:proofErr w:type="spellEnd"/>
+      <w:r>
+        <w:rPr>
+          <w:rFonts w:ascii="Aptos" w:hAnsi="Aptos" w:cs="Arial"/>
+          <w:sz w:val="28"/>
+          <w:szCs w:val="28"/>
+        </w:rPr>
+        <w:t xml:space="preserve"> </w:t>
+      </w:r>
+      <w:proofErr w:type="spellStart"/>
+      <w:r>
+        <w:rPr>
+          <w:rFonts w:ascii="Aptos" w:hAnsi="Aptos" w:cs="Arial"/>
+          <w:sz w:val="28"/>
+          <w:szCs w:val="28"/>
+        </w:rPr>
+        <w:t>proyek</w:t>
+      </w:r>
+      <w:proofErr w:type="spellEnd"/>
+      <w:r>
+        <w:rPr>
+          <w:rFonts w:ascii="Aptos" w:hAnsi="Aptos" w:cs="Arial"/>
+          <w:sz w:val="28"/>
+          <w:szCs w:val="28"/>
+        </w:rPr>
+        <w:t xml:space="preserve"> React. </w:t>
       </w:r>
     </w:p>
     <w:p>
@@ -970,7 +2314,79 @@
           <w:sz w:val="28"/>
           <w:szCs w:val="28"/>
         </w:rPr>
-        <w:t xml:space="preserve"> → Menggunakan Visual Studio Code beserta ekstensi pendukung React dan JavaScript. </w:t>
+        <w:t xml:space="preserve"> → </w:t>
+      </w:r>
+      <w:proofErr w:type="spellStart"/>
+      <w:r>
+        <w:rPr>
+          <w:rFonts w:ascii="Aptos" w:hAnsi="Aptos" w:cs="Arial"/>
+          <w:sz w:val="28"/>
+          <w:szCs w:val="28"/>
+        </w:rPr>
+        <w:t>Menggunakan</w:t>
+      </w:r>
+      <w:proofErr w:type="spellEnd"/>
+      <w:r>
+        <w:rPr>
+          <w:rFonts w:ascii="Aptos" w:hAnsi="Aptos" w:cs="Arial"/>
+          <w:sz w:val="28"/>
+          <w:szCs w:val="28"/>
+        </w:rPr>
+        <w:t xml:space="preserve"> Visual Studio Code </w:t>
+      </w:r>
+      <w:proofErr w:type="spellStart"/>
+      <w:r>
+        <w:rPr>
+          <w:rFonts w:ascii="Aptos" w:hAnsi="Aptos" w:cs="Arial"/>
+          <w:sz w:val="28"/>
+          <w:szCs w:val="28"/>
+        </w:rPr>
+        <w:t>beserta</w:t>
+      </w:r>
+      <w:proofErr w:type="spellEnd"/>
+      <w:r>
+        <w:rPr>
+          <w:rFonts w:ascii="Aptos" w:hAnsi="Aptos" w:cs="Arial"/>
+          <w:sz w:val="28"/>
+          <w:szCs w:val="28"/>
+        </w:rPr>
+        <w:t xml:space="preserve"> </w:t>
+      </w:r>
+      <w:proofErr w:type="spellStart"/>
+      <w:r>
+        <w:rPr>
+          <w:rFonts w:ascii="Aptos" w:hAnsi="Aptos" w:cs="Arial"/>
+          <w:sz w:val="28"/>
+          <w:szCs w:val="28"/>
+        </w:rPr>
+        <w:t>ekstensi</w:t>
+      </w:r>
+      <w:proofErr w:type="spellEnd"/>
+      <w:r>
+        <w:rPr>
+          <w:rFonts w:ascii="Aptos" w:hAnsi="Aptos" w:cs="Arial"/>
+          <w:sz w:val="28"/>
+          <w:szCs w:val="28"/>
+        </w:rPr>
+        <w:t xml:space="preserve"> </w:t>
+      </w:r>
+      <w:proofErr w:type="spellStart"/>
+      <w:r>
+        <w:rPr>
+          <w:rFonts w:ascii="Aptos" w:hAnsi="Aptos" w:cs="Arial"/>
+          <w:sz w:val="28"/>
+          <w:szCs w:val="28"/>
+        </w:rPr>
+        <w:t>pendukung</w:t>
+      </w:r>
+      <w:proofErr w:type="spellEnd"/>
+      <w:r>
+        <w:rPr>
+          <w:rFonts w:ascii="Aptos" w:hAnsi="Aptos" w:cs="Arial"/>
+          <w:sz w:val="28"/>
+          <w:szCs w:val="28"/>
+        </w:rPr>
+        <w:t xml:space="preserve"> React dan JavaScript. </w:t>
       </w:r>
     </w:p>
     <w:p>
@@ -1002,7 +2418,79 @@
           <w:sz w:val="28"/>
           <w:szCs w:val="28"/>
         </w:rPr>
-        <w:t xml:space="preserve"> → Google Chrome atau Mozilla Firefox untuk menjalankan dan debugging aplikasi.</w:t>
+        <w:t xml:space="preserve"> → Google Chrome </w:t>
+      </w:r>
+      <w:proofErr w:type="spellStart"/>
+      <w:r>
+        <w:rPr>
+          <w:rFonts w:ascii="Aptos" w:hAnsi="Aptos" w:cs="Arial"/>
+          <w:sz w:val="28"/>
+          <w:szCs w:val="28"/>
+        </w:rPr>
+        <w:t>atau</w:t>
+      </w:r>
+      <w:proofErr w:type="spellEnd"/>
+      <w:r>
+        <w:rPr>
+          <w:rFonts w:ascii="Aptos" w:hAnsi="Aptos" w:cs="Arial"/>
+          <w:sz w:val="28"/>
+          <w:szCs w:val="28"/>
+        </w:rPr>
+        <w:t xml:space="preserve"> Mozilla Firefox </w:t>
+      </w:r>
+      <w:proofErr w:type="spellStart"/>
+      <w:r>
+        <w:rPr>
+          <w:rFonts w:ascii="Aptos" w:hAnsi="Aptos" w:cs="Arial"/>
+          <w:sz w:val="28"/>
+          <w:szCs w:val="28"/>
+        </w:rPr>
+        <w:t>untuk</w:t>
+      </w:r>
+      <w:proofErr w:type="spellEnd"/>
+      <w:r>
+        <w:rPr>
+          <w:rFonts w:ascii="Aptos" w:hAnsi="Aptos" w:cs="Arial"/>
+          <w:sz w:val="28"/>
+          <w:szCs w:val="28"/>
+        </w:rPr>
+        <w:t xml:space="preserve"> </w:t>
+      </w:r>
+      <w:proofErr w:type="spellStart"/>
+      <w:r>
+        <w:rPr>
+          <w:rFonts w:ascii="Aptos" w:hAnsi="Aptos" w:cs="Arial"/>
+          <w:sz w:val="28"/>
+          <w:szCs w:val="28"/>
+        </w:rPr>
+        <w:t>menjalankan</w:t>
+      </w:r>
+      <w:proofErr w:type="spellEnd"/>
+      <w:r>
+        <w:rPr>
+          <w:rFonts w:ascii="Aptos" w:hAnsi="Aptos" w:cs="Arial"/>
+          <w:sz w:val="28"/>
+          <w:szCs w:val="28"/>
+        </w:rPr>
+        <w:t xml:space="preserve"> dan debugging </w:t>
+      </w:r>
+      <w:proofErr w:type="spellStart"/>
+      <w:r>
+        <w:rPr>
+          <w:rFonts w:ascii="Aptos" w:hAnsi="Aptos" w:cs="Arial"/>
+          <w:sz w:val="28"/>
+          <w:szCs w:val="28"/>
+        </w:rPr>
+        <w:t>aplikasi</w:t>
+      </w:r>
+      <w:proofErr w:type="spellEnd"/>
+      <w:r>
+        <w:rPr>
+          <w:rFonts w:ascii="Aptos" w:hAnsi="Aptos" w:cs="Arial"/>
+          <w:sz w:val="28"/>
+          <w:szCs w:val="28"/>
+        </w:rPr>
+        <w:t>.</w:t>
       </w:r>
     </w:p>
     <w:p>
@@ -1102,43 +2590,7 @@
           <w:szCs w:val="28"/>
           <w:lang w:val="id-ID"/>
         </w:rPr>
-        <w:t xml:space="preserve">Membuat folder pekan 11 lalu melakukan comand promt atau cmd dan melakukan </w:t>
-      </w:r>
-      <w:r>
-        <w:rPr>
-          <w:rFonts w:ascii="Aptos" w:hAnsi="Aptos" w:cs="Arial"/>
-          <w:sz w:val="28"/>
-          <w:szCs w:val="28"/>
-          <w:lang w:val="id-ID"/>
-        </w:rPr>
-        <w:t>Inisialisasi aplikasi React menggunakan Vite</w:t>
-      </w:r>
-      <w:r>
-        <w:rPr>
-          <w:rFonts w:ascii="Aptos" w:hAnsi="Aptos" w:cs="Arial"/>
-          <w:sz w:val="28"/>
-          <w:szCs w:val="28"/>
-          <w:lang w:val="id-ID"/>
-        </w:rPr>
-        <w:t xml:space="preserve"> dengan menjalankan perintah </w:t>
-      </w:r>
-      <w:r>
-        <w:rPr>
-          <w:rFonts w:ascii="Aptos" w:hAnsi="Aptos" w:cs="Arial"/>
-          <w:sz w:val="28"/>
-          <w:szCs w:val="28"/>
-          <w:lang w:val="id-ID"/>
-        </w:rPr>
-        <w:t>npm create vite@latest</w:t>
-      </w:r>
-      <w:r>
-        <w:rPr>
-          <w:rFonts w:ascii="Aptos" w:hAnsi="Aptos" w:cs="Arial"/>
-          <w:sz w:val="28"/>
-          <w:szCs w:val="28"/>
-          <w:lang w:val="id-ID"/>
-        </w:rPr>
-        <w:t>.</w:t>
+        <w:t>Membuat folder pekan 11 lalu melakukan comand promt atau cmd dan melakukan Inisialisasi aplikasi React menggunakan Vite dengan menjalankan perintah npm create vite@latest.</w:t>
       </w:r>
     </w:p>
     <w:p>
@@ -1162,25 +2614,7 @@
           <w:szCs w:val="28"/>
           <w:lang w:val="id-ID"/>
         </w:rPr>
-        <w:t xml:space="preserve">Melakukan  penginstalan setelah menjalankan perintah </w:t>
-      </w:r>
-      <w:r>
-        <w:rPr>
-          <w:rFonts w:ascii="Aptos" w:hAnsi="Aptos" w:cs="Arial"/>
-          <w:sz w:val="28"/>
-          <w:szCs w:val="28"/>
-          <w:lang w:val="id-ID"/>
-        </w:rPr>
-        <w:t>npm create vite@latest</w:t>
-      </w:r>
-      <w:r>
-        <w:rPr>
-          <w:rFonts w:ascii="Aptos" w:hAnsi="Aptos" w:cs="Arial"/>
-          <w:sz w:val="28"/>
-          <w:szCs w:val="28"/>
-          <w:lang w:val="id-ID"/>
-        </w:rPr>
-        <w:t xml:space="preserve"> di cdm dan proses inisialisasinya.</w:t>
+        <w:t>Melakukan  penginstalan setelah menjalankan perintah npm create vite@latest di cdm dan proses inisialisasinya.</w:t>
       </w:r>
     </w:p>
     <w:p>
@@ -1264,7 +2698,29 @@
           <w:sz w:val="44"/>
           <w:szCs w:val="44"/>
         </w:rPr>
-        <w:t>Hasil dan Dokumentasi Program</w:t>
+        <w:t xml:space="preserve">Hasil dan </w:t>
+      </w:r>
+      <w:proofErr w:type="spellStart"/>
+      <w:r>
+        <w:rPr>
+          <w:rFonts w:ascii="Aptos Display" w:hAnsi="Aptos Display"/>
+          <w:b/>
+          <w:bCs/>
+          <w:sz w:val="44"/>
+          <w:szCs w:val="44"/>
+        </w:rPr>
+        <w:t>Dokumentasi</w:t>
+      </w:r>
+      <w:proofErr w:type="spellEnd"/>
+      <w:r>
+        <w:rPr>
+          <w:rFonts w:ascii="Aptos Display" w:hAnsi="Aptos Display"/>
+          <w:b/>
+          <w:bCs/>
+          <w:sz w:val="44"/>
+          <w:szCs w:val="44"/>
+        </w:rPr>
+        <w:t xml:space="preserve"> Program</w:t>
       </w:r>
     </w:p>
     <w:p>
@@ -1306,6 +2762,7 @@
           <w:szCs w:val="28"/>
         </w:rPr>
       </w:pPr>
+      <w:proofErr w:type="spellStart"/>
       <w:r>
         <w:rPr>
           <w:rFonts w:ascii="Aptos" w:hAnsi="Aptos" w:cs="Sans Serif Collection"/>
@@ -1314,6 +2771,7 @@
         </w:rPr>
         <w:t>Activityitem.jsx</w:t>
       </w:r>
+      <w:proofErr w:type="spellEnd"/>
     </w:p>
     <w:p>
       <w:pPr>
@@ -1328,6 +2786,7 @@
       <w:r>
         <w:rPr>
           <w:rFonts w:ascii="Aptos" w:hAnsi="Aptos" w:cs="Sans Serif Collection"/>
+          <w:noProof/>
           <w:sz w:val="28"/>
           <w:szCs w:val="28"/>
         </w:rPr>
@@ -1403,6 +2862,7 @@
           <w:szCs w:val="28"/>
         </w:rPr>
       </w:pPr>
+      <w:proofErr w:type="spellStart"/>
       <w:r>
         <w:rPr>
           <w:rFonts w:ascii="Aptos" w:hAnsi="Aptos" w:cs="Sans Serif Collection"/>
@@ -1420,6 +2880,7 @@
         </w:rPr>
         <w:t>pp.jsx</w:t>
       </w:r>
+      <w:proofErr w:type="spellEnd"/>
     </w:p>
     <w:p>
       <w:pPr>
@@ -1539,14 +3000,88 @@
           <w:szCs w:val="28"/>
         </w:rPr>
       </w:pPr>
-      <w:r>
-        <w:rPr>
-          <w:rFonts w:ascii="Aptos" w:hAnsi="Aptos"/>
-          <w:sz w:val="28"/>
-          <w:szCs w:val="28"/>
-        </w:rPr>
-        <w:t>Tampilan website sebelum mengisi aktivitas mahasiswa</w:t>
-      </w:r>
+      <w:proofErr w:type="spellStart"/>
+      <w:r>
+        <w:rPr>
+          <w:rFonts w:ascii="Aptos" w:hAnsi="Aptos"/>
+          <w:sz w:val="28"/>
+          <w:szCs w:val="28"/>
+        </w:rPr>
+        <w:t>Tampilan</w:t>
+      </w:r>
+      <w:proofErr w:type="spellEnd"/>
+      <w:r>
+        <w:rPr>
+          <w:rFonts w:ascii="Aptos" w:hAnsi="Aptos"/>
+          <w:sz w:val="28"/>
+          <w:szCs w:val="28"/>
+        </w:rPr>
+        <w:t xml:space="preserve"> website </w:t>
+      </w:r>
+      <w:proofErr w:type="spellStart"/>
+      <w:r>
+        <w:rPr>
+          <w:rFonts w:ascii="Aptos" w:hAnsi="Aptos"/>
+          <w:sz w:val="28"/>
+          <w:szCs w:val="28"/>
+        </w:rPr>
+        <w:t>sebelum</w:t>
+      </w:r>
+      <w:proofErr w:type="spellEnd"/>
+      <w:r>
+        <w:rPr>
+          <w:rFonts w:ascii="Aptos" w:hAnsi="Aptos"/>
+          <w:sz w:val="28"/>
+          <w:szCs w:val="28"/>
+        </w:rPr>
+        <w:t xml:space="preserve"> </w:t>
+      </w:r>
+      <w:proofErr w:type="spellStart"/>
+      <w:r>
+        <w:rPr>
+          <w:rFonts w:ascii="Aptos" w:hAnsi="Aptos"/>
+          <w:sz w:val="28"/>
+          <w:szCs w:val="28"/>
+        </w:rPr>
+        <w:t>mengisi</w:t>
+      </w:r>
+      <w:proofErr w:type="spellEnd"/>
+      <w:r>
+        <w:rPr>
+          <w:rFonts w:ascii="Aptos" w:hAnsi="Aptos"/>
+          <w:sz w:val="28"/>
+          <w:szCs w:val="28"/>
+        </w:rPr>
+        <w:t xml:space="preserve"> </w:t>
+      </w:r>
+      <w:proofErr w:type="spellStart"/>
+      <w:r>
+        <w:rPr>
+          <w:rFonts w:ascii="Aptos" w:hAnsi="Aptos"/>
+          <w:sz w:val="28"/>
+          <w:szCs w:val="28"/>
+        </w:rPr>
+        <w:t>aktivitas</w:t>
+      </w:r>
+      <w:proofErr w:type="spellEnd"/>
+      <w:r>
+        <w:rPr>
+          <w:rFonts w:ascii="Aptos" w:hAnsi="Aptos"/>
+          <w:sz w:val="28"/>
+          <w:szCs w:val="28"/>
+        </w:rPr>
+        <w:t xml:space="preserve"> </w:t>
+      </w:r>
+      <w:proofErr w:type="spellStart"/>
+      <w:r>
+        <w:rPr>
+          <w:rFonts w:ascii="Aptos" w:hAnsi="Aptos"/>
+          <w:sz w:val="28"/>
+          <w:szCs w:val="28"/>
+        </w:rPr>
+        <w:t>mahasiswa</w:t>
+      </w:r>
+      <w:proofErr w:type="spellEnd"/>
     </w:p>
     <w:p>
       <w:pPr>
@@ -1628,14 +3163,88 @@
           <w:szCs w:val="28"/>
         </w:rPr>
       </w:pPr>
-      <w:r>
-        <w:rPr>
-          <w:rFonts w:ascii="Aptos" w:hAnsi="Aptos"/>
-          <w:sz w:val="28"/>
-          <w:szCs w:val="28"/>
-        </w:rPr>
-        <w:t>Tampilan website setelah mengisi aktivitas mahasiswa</w:t>
-      </w:r>
+      <w:proofErr w:type="spellStart"/>
+      <w:r>
+        <w:rPr>
+          <w:rFonts w:ascii="Aptos" w:hAnsi="Aptos"/>
+          <w:sz w:val="28"/>
+          <w:szCs w:val="28"/>
+        </w:rPr>
+        <w:t>Tampilan</w:t>
+      </w:r>
+      <w:proofErr w:type="spellEnd"/>
+      <w:r>
+        <w:rPr>
+          <w:rFonts w:ascii="Aptos" w:hAnsi="Aptos"/>
+          <w:sz w:val="28"/>
+          <w:szCs w:val="28"/>
+        </w:rPr>
+        <w:t xml:space="preserve"> website </w:t>
+      </w:r>
+      <w:proofErr w:type="spellStart"/>
+      <w:r>
+        <w:rPr>
+          <w:rFonts w:ascii="Aptos" w:hAnsi="Aptos"/>
+          <w:sz w:val="28"/>
+          <w:szCs w:val="28"/>
+        </w:rPr>
+        <w:t>setelah</w:t>
+      </w:r>
+      <w:proofErr w:type="spellEnd"/>
+      <w:r>
+        <w:rPr>
+          <w:rFonts w:ascii="Aptos" w:hAnsi="Aptos"/>
+          <w:sz w:val="28"/>
+          <w:szCs w:val="28"/>
+        </w:rPr>
+        <w:t xml:space="preserve"> </w:t>
+      </w:r>
+      <w:proofErr w:type="spellStart"/>
+      <w:r>
+        <w:rPr>
+          <w:rFonts w:ascii="Aptos" w:hAnsi="Aptos"/>
+          <w:sz w:val="28"/>
+          <w:szCs w:val="28"/>
+        </w:rPr>
+        <w:t>mengisi</w:t>
+      </w:r>
+      <w:proofErr w:type="spellEnd"/>
+      <w:r>
+        <w:rPr>
+          <w:rFonts w:ascii="Aptos" w:hAnsi="Aptos"/>
+          <w:sz w:val="28"/>
+          <w:szCs w:val="28"/>
+        </w:rPr>
+        <w:t xml:space="preserve"> </w:t>
+      </w:r>
+      <w:proofErr w:type="spellStart"/>
+      <w:r>
+        <w:rPr>
+          <w:rFonts w:ascii="Aptos" w:hAnsi="Aptos"/>
+          <w:sz w:val="28"/>
+          <w:szCs w:val="28"/>
+        </w:rPr>
+        <w:t>aktivitas</w:t>
+      </w:r>
+      <w:proofErr w:type="spellEnd"/>
+      <w:r>
+        <w:rPr>
+          <w:rFonts w:ascii="Aptos" w:hAnsi="Aptos"/>
+          <w:sz w:val="28"/>
+          <w:szCs w:val="28"/>
+        </w:rPr>
+        <w:t xml:space="preserve"> </w:t>
+      </w:r>
+      <w:proofErr w:type="spellStart"/>
+      <w:r>
+        <w:rPr>
+          <w:rFonts w:ascii="Aptos" w:hAnsi="Aptos"/>
+          <w:sz w:val="28"/>
+          <w:szCs w:val="28"/>
+        </w:rPr>
+        <w:t>mahasiswa</w:t>
+      </w:r>
+      <w:proofErr w:type="spellEnd"/>
     </w:p>
     <w:p>
       <w:pPr>
@@ -1717,14 +3326,106 @@
           <w:szCs w:val="28"/>
         </w:rPr>
       </w:pPr>
-      <w:r>
-        <w:rPr>
-          <w:rFonts w:ascii="Aptos" w:hAnsi="Aptos"/>
-          <w:sz w:val="28"/>
-          <w:szCs w:val="28"/>
-        </w:rPr>
-        <w:t>Tampilan Website setelah menghapus satu aktivitas mahasiswa</w:t>
-      </w:r>
+      <w:proofErr w:type="spellStart"/>
+      <w:r>
+        <w:rPr>
+          <w:rFonts w:ascii="Aptos" w:hAnsi="Aptos"/>
+          <w:sz w:val="28"/>
+          <w:szCs w:val="28"/>
+        </w:rPr>
+        <w:t>Tampilan</w:t>
+      </w:r>
+      <w:proofErr w:type="spellEnd"/>
+      <w:r>
+        <w:rPr>
+          <w:rFonts w:ascii="Aptos" w:hAnsi="Aptos"/>
+          <w:sz w:val="28"/>
+          <w:szCs w:val="28"/>
+        </w:rPr>
+        <w:t xml:space="preserve"> Website </w:t>
+      </w:r>
+      <w:proofErr w:type="spellStart"/>
+      <w:r>
+        <w:rPr>
+          <w:rFonts w:ascii="Aptos" w:hAnsi="Aptos"/>
+          <w:sz w:val="28"/>
+          <w:szCs w:val="28"/>
+        </w:rPr>
+        <w:t>setelah</w:t>
+      </w:r>
+      <w:proofErr w:type="spellEnd"/>
+      <w:r>
+        <w:rPr>
+          <w:rFonts w:ascii="Aptos" w:hAnsi="Aptos"/>
+          <w:sz w:val="28"/>
+          <w:szCs w:val="28"/>
+        </w:rPr>
+        <w:t xml:space="preserve"> </w:t>
+      </w:r>
+      <w:proofErr w:type="spellStart"/>
+      <w:r>
+        <w:rPr>
+          <w:rFonts w:ascii="Aptos" w:hAnsi="Aptos"/>
+          <w:sz w:val="28"/>
+          <w:szCs w:val="28"/>
+        </w:rPr>
+        <w:t>menghapus</w:t>
+      </w:r>
+      <w:proofErr w:type="spellEnd"/>
+      <w:r>
+        <w:rPr>
+          <w:rFonts w:ascii="Aptos" w:hAnsi="Aptos"/>
+          <w:sz w:val="28"/>
+          <w:szCs w:val="28"/>
+        </w:rPr>
+        <w:t xml:space="preserve"> </w:t>
+      </w:r>
+      <w:proofErr w:type="spellStart"/>
+      <w:r>
+        <w:rPr>
+          <w:rFonts w:ascii="Aptos" w:hAnsi="Aptos"/>
+          <w:sz w:val="28"/>
+          <w:szCs w:val="28"/>
+        </w:rPr>
+        <w:t>satu</w:t>
+      </w:r>
+      <w:proofErr w:type="spellEnd"/>
+      <w:r>
+        <w:rPr>
+          <w:rFonts w:ascii="Aptos" w:hAnsi="Aptos"/>
+          <w:sz w:val="28"/>
+          <w:szCs w:val="28"/>
+        </w:rPr>
+        <w:t xml:space="preserve"> </w:t>
+      </w:r>
+      <w:proofErr w:type="spellStart"/>
+      <w:r>
+        <w:rPr>
+          <w:rFonts w:ascii="Aptos" w:hAnsi="Aptos"/>
+          <w:sz w:val="28"/>
+          <w:szCs w:val="28"/>
+        </w:rPr>
+        <w:t>aktivitas</w:t>
+      </w:r>
+      <w:proofErr w:type="spellEnd"/>
+      <w:r>
+        <w:rPr>
+          <w:rFonts w:ascii="Aptos" w:hAnsi="Aptos"/>
+          <w:sz w:val="28"/>
+          <w:szCs w:val="28"/>
+        </w:rPr>
+        <w:t xml:space="preserve"> </w:t>
+      </w:r>
+      <w:proofErr w:type="spellStart"/>
+      <w:r>
+        <w:rPr>
+          <w:rFonts w:ascii="Aptos" w:hAnsi="Aptos"/>
+          <w:sz w:val="28"/>
+          <w:szCs w:val="28"/>
+        </w:rPr>
+        <w:t>mahasiswa</w:t>
+      </w:r>
+      <w:proofErr w:type="spellEnd"/>
     </w:p>
     <w:p>
       <w:pPr>
@@ -1847,7 +3548,781 @@
           <w:sz w:val="28"/>
           <w:szCs w:val="28"/>
         </w:rPr>
-        <w:t>Pada praktikum ini telah dibuat aplikasi daftar aktivitas mahasiswa menggunakan React. Aplikasi tersebut dapat digunakan untuk menambahkan aktivitas baru serta menghapus aktivitas yang sudah tidak diperlukan. Melalui praktikum ini, praktikan dapat memahami dasar penggunaan React dalam membangun antarmuka pengguna berbasis komponen. Selain itu, praktikan juga mempelajari pengelolaan data dan interaksi pengguna menggunakan state pada React</w:t>
+        <w:t xml:space="preserve">Pada </w:t>
+      </w:r>
+      <w:proofErr w:type="spellStart"/>
+      <w:r>
+        <w:rPr>
+          <w:rFonts w:ascii="Aptos" w:hAnsi="Aptos"/>
+          <w:sz w:val="28"/>
+          <w:szCs w:val="28"/>
+        </w:rPr>
+        <w:t>praktikum</w:t>
+      </w:r>
+      <w:proofErr w:type="spellEnd"/>
+      <w:r>
+        <w:rPr>
+          <w:rFonts w:ascii="Aptos" w:hAnsi="Aptos"/>
+          <w:sz w:val="28"/>
+          <w:szCs w:val="28"/>
+        </w:rPr>
+        <w:t xml:space="preserve"> </w:t>
+      </w:r>
+      <w:proofErr w:type="spellStart"/>
+      <w:r>
+        <w:rPr>
+          <w:rFonts w:ascii="Aptos" w:hAnsi="Aptos"/>
+          <w:sz w:val="28"/>
+          <w:szCs w:val="28"/>
+        </w:rPr>
+        <w:t>ini</w:t>
+      </w:r>
+      <w:proofErr w:type="spellEnd"/>
+      <w:r>
+        <w:rPr>
+          <w:rFonts w:ascii="Aptos" w:hAnsi="Aptos"/>
+          <w:sz w:val="28"/>
+          <w:szCs w:val="28"/>
+        </w:rPr>
+        <w:t xml:space="preserve"> </w:t>
+      </w:r>
+      <w:proofErr w:type="spellStart"/>
+      <w:r>
+        <w:rPr>
+          <w:rFonts w:ascii="Aptos" w:hAnsi="Aptos"/>
+          <w:sz w:val="28"/>
+          <w:szCs w:val="28"/>
+        </w:rPr>
+        <w:t>telah</w:t>
+      </w:r>
+      <w:proofErr w:type="spellEnd"/>
+      <w:r>
+        <w:rPr>
+          <w:rFonts w:ascii="Aptos" w:hAnsi="Aptos"/>
+          <w:sz w:val="28"/>
+          <w:szCs w:val="28"/>
+        </w:rPr>
+        <w:t xml:space="preserve"> </w:t>
+      </w:r>
+      <w:proofErr w:type="spellStart"/>
+      <w:r>
+        <w:rPr>
+          <w:rFonts w:ascii="Aptos" w:hAnsi="Aptos"/>
+          <w:sz w:val="28"/>
+          <w:szCs w:val="28"/>
+        </w:rPr>
+        <w:t>dibuat</w:t>
+      </w:r>
+      <w:proofErr w:type="spellEnd"/>
+      <w:r>
+        <w:rPr>
+          <w:rFonts w:ascii="Aptos" w:hAnsi="Aptos"/>
+          <w:sz w:val="28"/>
+          <w:szCs w:val="28"/>
+        </w:rPr>
+        <w:t xml:space="preserve"> </w:t>
+      </w:r>
+      <w:proofErr w:type="spellStart"/>
+      <w:r>
+        <w:rPr>
+          <w:rFonts w:ascii="Aptos" w:hAnsi="Aptos"/>
+          <w:sz w:val="28"/>
+          <w:szCs w:val="28"/>
+        </w:rPr>
+        <w:t>aplikasi</w:t>
+      </w:r>
+      <w:proofErr w:type="spellEnd"/>
+      <w:r>
+        <w:rPr>
+          <w:rFonts w:ascii="Aptos" w:hAnsi="Aptos"/>
+          <w:sz w:val="28"/>
+          <w:szCs w:val="28"/>
+        </w:rPr>
+        <w:t xml:space="preserve"> daftar </w:t>
+      </w:r>
+      <w:proofErr w:type="spellStart"/>
+      <w:r>
+        <w:rPr>
+          <w:rFonts w:ascii="Aptos" w:hAnsi="Aptos"/>
+          <w:sz w:val="28"/>
+          <w:szCs w:val="28"/>
+        </w:rPr>
+        <w:t>aktivitas</w:t>
+      </w:r>
+      <w:proofErr w:type="spellEnd"/>
+      <w:r>
+        <w:rPr>
+          <w:rFonts w:ascii="Aptos" w:hAnsi="Aptos"/>
+          <w:sz w:val="28"/>
+          <w:szCs w:val="28"/>
+        </w:rPr>
+        <w:t xml:space="preserve"> </w:t>
+      </w:r>
+      <w:proofErr w:type="spellStart"/>
+      <w:r>
+        <w:rPr>
+          <w:rFonts w:ascii="Aptos" w:hAnsi="Aptos"/>
+          <w:sz w:val="28"/>
+          <w:szCs w:val="28"/>
+        </w:rPr>
+        <w:t>mahasiswa</w:t>
+      </w:r>
+      <w:proofErr w:type="spellEnd"/>
+      <w:r>
+        <w:rPr>
+          <w:rFonts w:ascii="Aptos" w:hAnsi="Aptos"/>
+          <w:sz w:val="28"/>
+          <w:szCs w:val="28"/>
+        </w:rPr>
+        <w:t xml:space="preserve"> </w:t>
+      </w:r>
+      <w:proofErr w:type="spellStart"/>
+      <w:r>
+        <w:rPr>
+          <w:rFonts w:ascii="Aptos" w:hAnsi="Aptos"/>
+          <w:sz w:val="28"/>
+          <w:szCs w:val="28"/>
+        </w:rPr>
+        <w:t>menggunakan</w:t>
+      </w:r>
+      <w:proofErr w:type="spellEnd"/>
+      <w:r>
+        <w:rPr>
+          <w:rFonts w:ascii="Aptos" w:hAnsi="Aptos"/>
+          <w:sz w:val="28"/>
+          <w:szCs w:val="28"/>
+        </w:rPr>
+        <w:t xml:space="preserve"> React. </w:t>
+      </w:r>
+      <w:proofErr w:type="spellStart"/>
+      <w:r>
+        <w:rPr>
+          <w:rFonts w:ascii="Aptos" w:hAnsi="Aptos"/>
+          <w:sz w:val="28"/>
+          <w:szCs w:val="28"/>
+        </w:rPr>
+        <w:t>Aplikasi</w:t>
+      </w:r>
+      <w:proofErr w:type="spellEnd"/>
+      <w:r>
+        <w:rPr>
+          <w:rFonts w:ascii="Aptos" w:hAnsi="Aptos"/>
+          <w:sz w:val="28"/>
+          <w:szCs w:val="28"/>
+        </w:rPr>
+        <w:t xml:space="preserve"> </w:t>
+      </w:r>
+      <w:proofErr w:type="spellStart"/>
+      <w:r>
+        <w:rPr>
+          <w:rFonts w:ascii="Aptos" w:hAnsi="Aptos"/>
+          <w:sz w:val="28"/>
+          <w:szCs w:val="28"/>
+        </w:rPr>
+        <w:t>tersebut</w:t>
+      </w:r>
+      <w:proofErr w:type="spellEnd"/>
+      <w:r>
+        <w:rPr>
+          <w:rFonts w:ascii="Aptos" w:hAnsi="Aptos"/>
+          <w:sz w:val="28"/>
+          <w:szCs w:val="28"/>
+        </w:rPr>
+        <w:t xml:space="preserve"> </w:t>
+      </w:r>
+      <w:proofErr w:type="spellStart"/>
+      <w:r>
+        <w:rPr>
+          <w:rFonts w:ascii="Aptos" w:hAnsi="Aptos"/>
+          <w:sz w:val="28"/>
+          <w:szCs w:val="28"/>
+        </w:rPr>
+        <w:t>dapat</w:t>
+      </w:r>
+      <w:proofErr w:type="spellEnd"/>
+      <w:r>
+        <w:rPr>
+          <w:rFonts w:ascii="Aptos" w:hAnsi="Aptos"/>
+          <w:sz w:val="28"/>
+          <w:szCs w:val="28"/>
+        </w:rPr>
+        <w:t xml:space="preserve"> </w:t>
+      </w:r>
+      <w:proofErr w:type="spellStart"/>
+      <w:r>
+        <w:rPr>
+          <w:rFonts w:ascii="Aptos" w:hAnsi="Aptos"/>
+          <w:sz w:val="28"/>
+          <w:szCs w:val="28"/>
+        </w:rPr>
+        <w:t>digunakan</w:t>
+      </w:r>
+      <w:proofErr w:type="spellEnd"/>
+      <w:r>
+        <w:rPr>
+          <w:rFonts w:ascii="Aptos" w:hAnsi="Aptos"/>
+          <w:sz w:val="28"/>
+          <w:szCs w:val="28"/>
+        </w:rPr>
+        <w:t xml:space="preserve"> </w:t>
+      </w:r>
+      <w:proofErr w:type="spellStart"/>
+      <w:r>
+        <w:rPr>
+          <w:rFonts w:ascii="Aptos" w:hAnsi="Aptos"/>
+          <w:sz w:val="28"/>
+          <w:szCs w:val="28"/>
+        </w:rPr>
+        <w:t>untuk</w:t>
+      </w:r>
+      <w:proofErr w:type="spellEnd"/>
+      <w:r>
+        <w:rPr>
+          <w:rFonts w:ascii="Aptos" w:hAnsi="Aptos"/>
+          <w:sz w:val="28"/>
+          <w:szCs w:val="28"/>
+        </w:rPr>
+        <w:t xml:space="preserve"> </w:t>
+      </w:r>
+      <w:proofErr w:type="spellStart"/>
+      <w:r>
+        <w:rPr>
+          <w:rFonts w:ascii="Aptos" w:hAnsi="Aptos"/>
+          <w:sz w:val="28"/>
+          <w:szCs w:val="28"/>
+        </w:rPr>
+        <w:t>menambahkan</w:t>
+      </w:r>
+      <w:proofErr w:type="spellEnd"/>
+      <w:r>
+        <w:rPr>
+          <w:rFonts w:ascii="Aptos" w:hAnsi="Aptos"/>
+          <w:sz w:val="28"/>
+          <w:szCs w:val="28"/>
+        </w:rPr>
+        <w:t xml:space="preserve"> </w:t>
+      </w:r>
+      <w:proofErr w:type="spellStart"/>
+      <w:r>
+        <w:rPr>
+          <w:rFonts w:ascii="Aptos" w:hAnsi="Aptos"/>
+          <w:sz w:val="28"/>
+          <w:szCs w:val="28"/>
+        </w:rPr>
+        <w:t>aktivitas</w:t>
+      </w:r>
+      <w:proofErr w:type="spellEnd"/>
+      <w:r>
+        <w:rPr>
+          <w:rFonts w:ascii="Aptos" w:hAnsi="Aptos"/>
+          <w:sz w:val="28"/>
+          <w:szCs w:val="28"/>
+        </w:rPr>
+        <w:t xml:space="preserve"> </w:t>
+      </w:r>
+      <w:proofErr w:type="spellStart"/>
+      <w:r>
+        <w:rPr>
+          <w:rFonts w:ascii="Aptos" w:hAnsi="Aptos"/>
+          <w:sz w:val="28"/>
+          <w:szCs w:val="28"/>
+        </w:rPr>
+        <w:t>baru</w:t>
+      </w:r>
+      <w:proofErr w:type="spellEnd"/>
+      <w:r>
+        <w:rPr>
+          <w:rFonts w:ascii="Aptos" w:hAnsi="Aptos"/>
+          <w:sz w:val="28"/>
+          <w:szCs w:val="28"/>
+        </w:rPr>
+        <w:t xml:space="preserve"> </w:t>
+      </w:r>
+      <w:proofErr w:type="spellStart"/>
+      <w:r>
+        <w:rPr>
+          <w:rFonts w:ascii="Aptos" w:hAnsi="Aptos"/>
+          <w:sz w:val="28"/>
+          <w:szCs w:val="28"/>
+        </w:rPr>
+        <w:t>serta</w:t>
+      </w:r>
+      <w:proofErr w:type="spellEnd"/>
+      <w:r>
+        <w:rPr>
+          <w:rFonts w:ascii="Aptos" w:hAnsi="Aptos"/>
+          <w:sz w:val="28"/>
+          <w:szCs w:val="28"/>
+        </w:rPr>
+        <w:t xml:space="preserve"> </w:t>
+      </w:r>
+      <w:proofErr w:type="spellStart"/>
+      <w:r>
+        <w:rPr>
+          <w:rFonts w:ascii="Aptos" w:hAnsi="Aptos"/>
+          <w:sz w:val="28"/>
+          <w:szCs w:val="28"/>
+        </w:rPr>
+        <w:t>menghapus</w:t>
+      </w:r>
+      <w:proofErr w:type="spellEnd"/>
+      <w:r>
+        <w:rPr>
+          <w:rFonts w:ascii="Aptos" w:hAnsi="Aptos"/>
+          <w:sz w:val="28"/>
+          <w:szCs w:val="28"/>
+        </w:rPr>
+        <w:t xml:space="preserve"> </w:t>
+      </w:r>
+      <w:proofErr w:type="spellStart"/>
+      <w:r>
+        <w:rPr>
+          <w:rFonts w:ascii="Aptos" w:hAnsi="Aptos"/>
+          <w:sz w:val="28"/>
+          <w:szCs w:val="28"/>
+        </w:rPr>
+        <w:t>aktivitas</w:t>
+      </w:r>
+      <w:proofErr w:type="spellEnd"/>
+      <w:r>
+        <w:rPr>
+          <w:rFonts w:ascii="Aptos" w:hAnsi="Aptos"/>
+          <w:sz w:val="28"/>
+          <w:szCs w:val="28"/>
+        </w:rPr>
+        <w:t xml:space="preserve"> yang </w:t>
+      </w:r>
+      <w:proofErr w:type="spellStart"/>
+      <w:r>
+        <w:rPr>
+          <w:rFonts w:ascii="Aptos" w:hAnsi="Aptos"/>
+          <w:sz w:val="28"/>
+          <w:szCs w:val="28"/>
+        </w:rPr>
+        <w:t>sudah</w:t>
+      </w:r>
+      <w:proofErr w:type="spellEnd"/>
+      <w:r>
+        <w:rPr>
+          <w:rFonts w:ascii="Aptos" w:hAnsi="Aptos"/>
+          <w:sz w:val="28"/>
+          <w:szCs w:val="28"/>
+        </w:rPr>
+        <w:t xml:space="preserve"> </w:t>
+      </w:r>
+      <w:proofErr w:type="spellStart"/>
+      <w:r>
+        <w:rPr>
+          <w:rFonts w:ascii="Aptos" w:hAnsi="Aptos"/>
+          <w:sz w:val="28"/>
+          <w:szCs w:val="28"/>
+        </w:rPr>
+        <w:t>tidak</w:t>
+      </w:r>
+      <w:proofErr w:type="spellEnd"/>
+      <w:r>
+        <w:rPr>
+          <w:rFonts w:ascii="Aptos" w:hAnsi="Aptos"/>
+          <w:sz w:val="28"/>
+          <w:szCs w:val="28"/>
+        </w:rPr>
+        <w:t xml:space="preserve"> </w:t>
+      </w:r>
+      <w:proofErr w:type="spellStart"/>
+      <w:r>
+        <w:rPr>
+          <w:rFonts w:ascii="Aptos" w:hAnsi="Aptos"/>
+          <w:sz w:val="28"/>
+          <w:szCs w:val="28"/>
+        </w:rPr>
+        <w:t>diperlukan</w:t>
+      </w:r>
+      <w:proofErr w:type="spellEnd"/>
+      <w:r>
+        <w:rPr>
+          <w:rFonts w:ascii="Aptos" w:hAnsi="Aptos"/>
+          <w:sz w:val="28"/>
+          <w:szCs w:val="28"/>
+        </w:rPr>
+        <w:t xml:space="preserve">. </w:t>
+      </w:r>
+      <w:proofErr w:type="spellStart"/>
+      <w:r>
+        <w:rPr>
+          <w:rFonts w:ascii="Aptos" w:hAnsi="Aptos"/>
+          <w:sz w:val="28"/>
+          <w:szCs w:val="28"/>
+        </w:rPr>
+        <w:t>Melalui</w:t>
+      </w:r>
+      <w:proofErr w:type="spellEnd"/>
+      <w:r>
+        <w:rPr>
+          <w:rFonts w:ascii="Aptos" w:hAnsi="Aptos"/>
+          <w:sz w:val="28"/>
+          <w:szCs w:val="28"/>
+        </w:rPr>
+        <w:t xml:space="preserve"> </w:t>
+      </w:r>
+      <w:proofErr w:type="spellStart"/>
+      <w:r>
+        <w:rPr>
+          <w:rFonts w:ascii="Aptos" w:hAnsi="Aptos"/>
+          <w:sz w:val="28"/>
+          <w:szCs w:val="28"/>
+        </w:rPr>
+        <w:t>praktikum</w:t>
+      </w:r>
+      <w:proofErr w:type="spellEnd"/>
+      <w:r>
+        <w:rPr>
+          <w:rFonts w:ascii="Aptos" w:hAnsi="Aptos"/>
+          <w:sz w:val="28"/>
+          <w:szCs w:val="28"/>
+        </w:rPr>
+        <w:t xml:space="preserve"> </w:t>
+      </w:r>
+      <w:proofErr w:type="spellStart"/>
+      <w:r>
+        <w:rPr>
+          <w:rFonts w:ascii="Aptos" w:hAnsi="Aptos"/>
+          <w:sz w:val="28"/>
+          <w:szCs w:val="28"/>
+        </w:rPr>
+        <w:t>ini</w:t>
+      </w:r>
+      <w:proofErr w:type="spellEnd"/>
+      <w:r>
+        <w:rPr>
+          <w:rFonts w:ascii="Aptos" w:hAnsi="Aptos"/>
+          <w:sz w:val="28"/>
+          <w:szCs w:val="28"/>
+        </w:rPr>
+        <w:t xml:space="preserve">, </w:t>
+      </w:r>
+      <w:proofErr w:type="spellStart"/>
+      <w:r>
+        <w:rPr>
+          <w:rFonts w:ascii="Aptos" w:hAnsi="Aptos"/>
+          <w:sz w:val="28"/>
+          <w:szCs w:val="28"/>
+        </w:rPr>
+        <w:t>praktikan</w:t>
+      </w:r>
+      <w:proofErr w:type="spellEnd"/>
+      <w:r>
+        <w:rPr>
+          <w:rFonts w:ascii="Aptos" w:hAnsi="Aptos"/>
+          <w:sz w:val="28"/>
+          <w:szCs w:val="28"/>
+        </w:rPr>
+        <w:t xml:space="preserve"> </w:t>
+      </w:r>
+      <w:proofErr w:type="spellStart"/>
+      <w:r>
+        <w:rPr>
+          <w:rFonts w:ascii="Aptos" w:hAnsi="Aptos"/>
+          <w:sz w:val="28"/>
+          <w:szCs w:val="28"/>
+        </w:rPr>
+        <w:t>dapat</w:t>
+      </w:r>
+      <w:proofErr w:type="spellEnd"/>
+      <w:r>
+        <w:rPr>
+          <w:rFonts w:ascii="Aptos" w:hAnsi="Aptos"/>
+          <w:sz w:val="28"/>
+          <w:szCs w:val="28"/>
+        </w:rPr>
+        <w:t xml:space="preserve"> </w:t>
+      </w:r>
+      <w:proofErr w:type="spellStart"/>
+      <w:r>
+        <w:rPr>
+          <w:rFonts w:ascii="Aptos" w:hAnsi="Aptos"/>
+          <w:sz w:val="28"/>
+          <w:szCs w:val="28"/>
+        </w:rPr>
+        <w:t>memahami</w:t>
+      </w:r>
+      <w:proofErr w:type="spellEnd"/>
+      <w:r>
+        <w:rPr>
+          <w:rFonts w:ascii="Aptos" w:hAnsi="Aptos"/>
+          <w:sz w:val="28"/>
+          <w:szCs w:val="28"/>
+        </w:rPr>
+        <w:t xml:space="preserve"> </w:t>
+      </w:r>
+      <w:proofErr w:type="spellStart"/>
+      <w:r>
+        <w:rPr>
+          <w:rFonts w:ascii="Aptos" w:hAnsi="Aptos"/>
+          <w:sz w:val="28"/>
+          <w:szCs w:val="28"/>
+        </w:rPr>
+        <w:t>dasar</w:t>
+      </w:r>
+      <w:proofErr w:type="spellEnd"/>
+      <w:r>
+        <w:rPr>
+          <w:rFonts w:ascii="Aptos" w:hAnsi="Aptos"/>
+          <w:sz w:val="28"/>
+          <w:szCs w:val="28"/>
+        </w:rPr>
+        <w:t xml:space="preserve"> </w:t>
+      </w:r>
+      <w:proofErr w:type="spellStart"/>
+      <w:r>
+        <w:rPr>
+          <w:rFonts w:ascii="Aptos" w:hAnsi="Aptos"/>
+          <w:sz w:val="28"/>
+          <w:szCs w:val="28"/>
+        </w:rPr>
+        <w:t>penggunaan</w:t>
+      </w:r>
+      <w:proofErr w:type="spellEnd"/>
+      <w:r>
+        <w:rPr>
+          <w:rFonts w:ascii="Aptos" w:hAnsi="Aptos"/>
+          <w:sz w:val="28"/>
+          <w:szCs w:val="28"/>
+        </w:rPr>
+        <w:t xml:space="preserve"> React </w:t>
+      </w:r>
+      <w:proofErr w:type="spellStart"/>
+      <w:r>
+        <w:rPr>
+          <w:rFonts w:ascii="Aptos" w:hAnsi="Aptos"/>
+          <w:sz w:val="28"/>
+          <w:szCs w:val="28"/>
+        </w:rPr>
+        <w:t>dalam</w:t>
+      </w:r>
+      <w:proofErr w:type="spellEnd"/>
+      <w:r>
+        <w:rPr>
+          <w:rFonts w:ascii="Aptos" w:hAnsi="Aptos"/>
+          <w:sz w:val="28"/>
+          <w:szCs w:val="28"/>
+        </w:rPr>
+        <w:t xml:space="preserve"> </w:t>
+      </w:r>
+      <w:proofErr w:type="spellStart"/>
+      <w:r>
+        <w:rPr>
+          <w:rFonts w:ascii="Aptos" w:hAnsi="Aptos"/>
+          <w:sz w:val="28"/>
+          <w:szCs w:val="28"/>
+        </w:rPr>
+        <w:t>membangun</w:t>
+      </w:r>
+      <w:proofErr w:type="spellEnd"/>
+      <w:r>
+        <w:rPr>
+          <w:rFonts w:ascii="Aptos" w:hAnsi="Aptos"/>
+          <w:sz w:val="28"/>
+          <w:szCs w:val="28"/>
+        </w:rPr>
+        <w:t xml:space="preserve"> </w:t>
+      </w:r>
+      <w:proofErr w:type="spellStart"/>
+      <w:r>
+        <w:rPr>
+          <w:rFonts w:ascii="Aptos" w:hAnsi="Aptos"/>
+          <w:sz w:val="28"/>
+          <w:szCs w:val="28"/>
+        </w:rPr>
+        <w:t>antarmuka</w:t>
+      </w:r>
+      <w:proofErr w:type="spellEnd"/>
+      <w:r>
+        <w:rPr>
+          <w:rFonts w:ascii="Aptos" w:hAnsi="Aptos"/>
+          <w:sz w:val="28"/>
+          <w:szCs w:val="28"/>
+        </w:rPr>
+        <w:t xml:space="preserve"> </w:t>
+      </w:r>
+      <w:proofErr w:type="spellStart"/>
+      <w:r>
+        <w:rPr>
+          <w:rFonts w:ascii="Aptos" w:hAnsi="Aptos"/>
+          <w:sz w:val="28"/>
+          <w:szCs w:val="28"/>
+        </w:rPr>
+        <w:t>pengguna</w:t>
+      </w:r>
+      <w:proofErr w:type="spellEnd"/>
+      <w:r>
+        <w:rPr>
+          <w:rFonts w:ascii="Aptos" w:hAnsi="Aptos"/>
+          <w:sz w:val="28"/>
+          <w:szCs w:val="28"/>
+        </w:rPr>
+        <w:t xml:space="preserve"> </w:t>
+      </w:r>
+      <w:proofErr w:type="spellStart"/>
+      <w:r>
+        <w:rPr>
+          <w:rFonts w:ascii="Aptos" w:hAnsi="Aptos"/>
+          <w:sz w:val="28"/>
+          <w:szCs w:val="28"/>
+        </w:rPr>
+        <w:t>berbasis</w:t>
+      </w:r>
+      <w:proofErr w:type="spellEnd"/>
+      <w:r>
+        <w:rPr>
+          <w:rFonts w:ascii="Aptos" w:hAnsi="Aptos"/>
+          <w:sz w:val="28"/>
+          <w:szCs w:val="28"/>
+        </w:rPr>
+        <w:t xml:space="preserve"> </w:t>
+      </w:r>
+      <w:proofErr w:type="spellStart"/>
+      <w:r>
+        <w:rPr>
+          <w:rFonts w:ascii="Aptos" w:hAnsi="Aptos"/>
+          <w:sz w:val="28"/>
+          <w:szCs w:val="28"/>
+        </w:rPr>
+        <w:t>komponen</w:t>
+      </w:r>
+      <w:proofErr w:type="spellEnd"/>
+      <w:r>
+        <w:rPr>
+          <w:rFonts w:ascii="Aptos" w:hAnsi="Aptos"/>
+          <w:sz w:val="28"/>
+          <w:szCs w:val="28"/>
+        </w:rPr>
+        <w:t xml:space="preserve">. Selain </w:t>
+      </w:r>
+      <w:proofErr w:type="spellStart"/>
+      <w:r>
+        <w:rPr>
+          <w:rFonts w:ascii="Aptos" w:hAnsi="Aptos"/>
+          <w:sz w:val="28"/>
+          <w:szCs w:val="28"/>
+        </w:rPr>
+        <w:t>itu</w:t>
+      </w:r>
+      <w:proofErr w:type="spellEnd"/>
+      <w:r>
+        <w:rPr>
+          <w:rFonts w:ascii="Aptos" w:hAnsi="Aptos"/>
+          <w:sz w:val="28"/>
+          <w:szCs w:val="28"/>
+        </w:rPr>
+        <w:t xml:space="preserve">, </w:t>
+      </w:r>
+      <w:proofErr w:type="spellStart"/>
+      <w:r>
+        <w:rPr>
+          <w:rFonts w:ascii="Aptos" w:hAnsi="Aptos"/>
+          <w:sz w:val="28"/>
+          <w:szCs w:val="28"/>
+        </w:rPr>
+        <w:t>praktikan</w:t>
+      </w:r>
+      <w:proofErr w:type="spellEnd"/>
+      <w:r>
+        <w:rPr>
+          <w:rFonts w:ascii="Aptos" w:hAnsi="Aptos"/>
+          <w:sz w:val="28"/>
+          <w:szCs w:val="28"/>
+        </w:rPr>
+        <w:t xml:space="preserve"> juga </w:t>
+      </w:r>
+      <w:proofErr w:type="spellStart"/>
+      <w:r>
+        <w:rPr>
+          <w:rFonts w:ascii="Aptos" w:hAnsi="Aptos"/>
+          <w:sz w:val="28"/>
+          <w:szCs w:val="28"/>
+        </w:rPr>
+        <w:t>mempelajari</w:t>
+      </w:r>
+      <w:proofErr w:type="spellEnd"/>
+      <w:r>
+        <w:rPr>
+          <w:rFonts w:ascii="Aptos" w:hAnsi="Aptos"/>
+          <w:sz w:val="28"/>
+          <w:szCs w:val="28"/>
+        </w:rPr>
+        <w:t xml:space="preserve"> </w:t>
+      </w:r>
+      <w:proofErr w:type="spellStart"/>
+      <w:r>
+        <w:rPr>
+          <w:rFonts w:ascii="Aptos" w:hAnsi="Aptos"/>
+          <w:sz w:val="28"/>
+          <w:szCs w:val="28"/>
+        </w:rPr>
+        <w:t>pengelolaan</w:t>
+      </w:r>
+      <w:proofErr w:type="spellEnd"/>
+      <w:r>
+        <w:rPr>
+          <w:rFonts w:ascii="Aptos" w:hAnsi="Aptos"/>
+          <w:sz w:val="28"/>
+          <w:szCs w:val="28"/>
+        </w:rPr>
+        <w:t xml:space="preserve"> data dan </w:t>
+      </w:r>
+      <w:proofErr w:type="spellStart"/>
+      <w:r>
+        <w:rPr>
+          <w:rFonts w:ascii="Aptos" w:hAnsi="Aptos"/>
+          <w:sz w:val="28"/>
+          <w:szCs w:val="28"/>
+        </w:rPr>
+        <w:t>interaksi</w:t>
+      </w:r>
+      <w:proofErr w:type="spellEnd"/>
+      <w:r>
+        <w:rPr>
+          <w:rFonts w:ascii="Aptos" w:hAnsi="Aptos"/>
+          <w:sz w:val="28"/>
+          <w:szCs w:val="28"/>
+        </w:rPr>
+        <w:t xml:space="preserve"> </w:t>
+      </w:r>
+      <w:proofErr w:type="spellStart"/>
+      <w:r>
+        <w:rPr>
+          <w:rFonts w:ascii="Aptos" w:hAnsi="Aptos"/>
+          <w:sz w:val="28"/>
+          <w:szCs w:val="28"/>
+        </w:rPr>
+        <w:t>pengguna</w:t>
+      </w:r>
+      <w:proofErr w:type="spellEnd"/>
+      <w:r>
+        <w:rPr>
+          <w:rFonts w:ascii="Aptos" w:hAnsi="Aptos"/>
+          <w:sz w:val="28"/>
+          <w:szCs w:val="28"/>
+        </w:rPr>
+        <w:t xml:space="preserve"> </w:t>
+      </w:r>
+      <w:proofErr w:type="spellStart"/>
+      <w:r>
+        <w:rPr>
+          <w:rFonts w:ascii="Aptos" w:hAnsi="Aptos"/>
+          <w:sz w:val="28"/>
+          <w:szCs w:val="28"/>
+        </w:rPr>
+        <w:t>menggunakan</w:t>
+      </w:r>
+      <w:proofErr w:type="spellEnd"/>
+      <w:r>
+        <w:rPr>
+          <w:rFonts w:ascii="Aptos" w:hAnsi="Aptos"/>
+          <w:sz w:val="28"/>
+          <w:szCs w:val="28"/>
+        </w:rPr>
+        <w:t xml:space="preserve"> state pada React</w:t>
       </w:r>
       <w:r>
         <w:rPr>
@@ -1904,8 +4379,20 @@
           <w:sz w:val="44"/>
           <w:szCs w:val="44"/>
         </w:rPr>
-        <w:t>Lampiran Link Github</w:t>
-      </w:r>
+        <w:t xml:space="preserve">Lampiran Link </w:t>
+      </w:r>
+      <w:proofErr w:type="spellStart"/>
+      <w:r>
+        <w:rPr>
+          <w:rFonts w:ascii="Aptos Display" w:hAnsi="Aptos Display"/>
+          <w:b/>
+          <w:bCs/>
+          <w:sz w:val="44"/>
+          <w:szCs w:val="44"/>
+        </w:rPr>
+        <w:t>Github</w:t>
+      </w:r>
+      <w:proofErr w:type="spellEnd"/>
     </w:p>
     <w:p>
       <w:pPr>
@@ -5293,6 +7780,7 @@
   <w:style w:type="character" w:default="1" w:styleId="DefaultParagraphFont">
     <w:name w:val="Default Paragraph Font"/>
     <w:uiPriority w:val="1"/>
+    <w:semiHidden/>
     <w:unhideWhenUsed/>
   </w:style>
   <w:style w:type="table" w:default="1" w:styleId="TableNormal">

</xml_diff>